<commit_message>
[feature] capacitaciones de coursera
</commit_message>
<xml_diff>
--- a/public/docs/cv/cv-simple.docx
+++ b/public/docs/cv/cv-simple.docx
@@ -409,6 +409,7 @@
           <w:szCs w:val="20"/>
         </w:rPr>
       </w:pPr>
+      <w:proofErr w:type="spellStart"/>
       <w:r>
         <w:rPr>
           <w:rFonts w:ascii="Tahoma" w:eastAsia="Tahoma" w:hAnsi="Tahoma" w:cs="Tahoma"/>
@@ -417,6 +418,7 @@
         </w:rPr>
         <w:t>TypeScript</w:t>
       </w:r>
+      <w:proofErr w:type="spellEnd"/>
     </w:p>
     <w:p>
       <w:pPr>
@@ -557,6 +559,7 @@
           <w:szCs w:val="20"/>
         </w:rPr>
       </w:pPr>
+      <w:proofErr w:type="spellStart"/>
       <w:r>
         <w:rPr>
           <w:rFonts w:ascii="Tahoma" w:eastAsia="Tahoma" w:hAnsi="Tahoma" w:cs="Tahoma"/>
@@ -565,6 +568,7 @@
         </w:rPr>
         <w:t>Symfony</w:t>
       </w:r>
+      <w:proofErr w:type="spellEnd"/>
     </w:p>
     <w:p>
       <w:pPr>
@@ -601,13 +605,23 @@
           <w:szCs w:val="20"/>
         </w:rPr>
       </w:pPr>
-      <w:r>
-        <w:rPr>
-          <w:rFonts w:ascii="Tahoma" w:eastAsia="Tahoma" w:hAnsi="Tahoma" w:cs="Tahoma"/>
-          <w:sz w:val="20"/>
-          <w:szCs w:val="20"/>
-        </w:rPr>
-        <w:t>React JS</w:t>
+      <w:proofErr w:type="spellStart"/>
+      <w:r>
+        <w:rPr>
+          <w:rFonts w:ascii="Tahoma" w:eastAsia="Tahoma" w:hAnsi="Tahoma" w:cs="Tahoma"/>
+          <w:sz w:val="20"/>
+          <w:szCs w:val="20"/>
+        </w:rPr>
+        <w:t>React</w:t>
+      </w:r>
+      <w:proofErr w:type="spellEnd"/>
+      <w:r>
+        <w:rPr>
+          <w:rFonts w:ascii="Tahoma" w:eastAsia="Tahoma" w:hAnsi="Tahoma" w:cs="Tahoma"/>
+          <w:sz w:val="20"/>
+          <w:szCs w:val="20"/>
+        </w:rPr>
+        <w:t xml:space="preserve"> JS</w:t>
       </w:r>
     </w:p>
     <w:p>
@@ -673,8 +687,18 @@
           <w:sz w:val="20"/>
           <w:szCs w:val="20"/>
         </w:rPr>
-        <w:t>RPA Uipath</w:t>
-      </w:r>
+        <w:t xml:space="preserve">RPA </w:t>
+      </w:r>
+      <w:proofErr w:type="spellStart"/>
+      <w:r>
+        <w:rPr>
+          <w:rFonts w:ascii="Tahoma" w:eastAsia="Tahoma" w:hAnsi="Tahoma" w:cs="Tahoma"/>
+          <w:sz w:val="20"/>
+          <w:szCs w:val="20"/>
+        </w:rPr>
+        <w:t>Uipath</w:t>
+      </w:r>
+      <w:proofErr w:type="spellEnd"/>
     </w:p>
     <w:p>
       <w:pPr>
@@ -1189,13 +1213,23 @@
         </w:rPr>
         <w:t>English (</w:t>
       </w:r>
-      <w:r>
-        <w:rPr>
-          <w:rFonts w:ascii="Tahoma" w:eastAsia="Tahoma" w:hAnsi="Tahoma" w:cs="Tahoma"/>
-          <w:sz w:val="20"/>
-          <w:szCs w:val="20"/>
-        </w:rPr>
-        <w:t>Pre-intermedio – A2</w:t>
+      <w:proofErr w:type="spellStart"/>
+      <w:r>
+        <w:rPr>
+          <w:rFonts w:ascii="Tahoma" w:eastAsia="Tahoma" w:hAnsi="Tahoma" w:cs="Tahoma"/>
+          <w:sz w:val="20"/>
+          <w:szCs w:val="20"/>
+        </w:rPr>
+        <w:t>Pre-intermedio</w:t>
+      </w:r>
+      <w:proofErr w:type="spellEnd"/>
+      <w:r>
+        <w:rPr>
+          <w:rFonts w:ascii="Tahoma" w:eastAsia="Tahoma" w:hAnsi="Tahoma" w:cs="Tahoma"/>
+          <w:sz w:val="20"/>
+          <w:szCs w:val="20"/>
+        </w:rPr>
+        <w:t xml:space="preserve"> – A2</w:t>
       </w:r>
       <w:r>
         <w:rPr>
@@ -1301,7 +1335,33 @@
           <w:szCs w:val="20"/>
           <w:lang w:val="es-PE"/>
         </w:rPr>
-        <w:t>Full Stack Developer .Net / Angular</w:t>
+        <w:t xml:space="preserve">Full Stack </w:t>
+      </w:r>
+      <w:proofErr w:type="spellStart"/>
+      <w:r>
+        <w:rPr>
+          <w:rFonts w:ascii="Tahoma" w:eastAsia="Tahoma" w:hAnsi="Tahoma" w:cs="Tahoma"/>
+          <w:b/>
+          <w:bCs/>
+          <w:iCs/>
+          <w:sz w:val="20"/>
+          <w:szCs w:val="20"/>
+          <w:lang w:val="es-PE"/>
+        </w:rPr>
+        <w:t>Developer</w:t>
+      </w:r>
+      <w:proofErr w:type="spellEnd"/>
+      <w:r>
+        <w:rPr>
+          <w:rFonts w:ascii="Tahoma" w:eastAsia="Tahoma" w:hAnsi="Tahoma" w:cs="Tahoma"/>
+          <w:b/>
+          <w:bCs/>
+          <w:iCs/>
+          <w:sz w:val="20"/>
+          <w:szCs w:val="20"/>
+          <w:lang w:val="es-PE"/>
+        </w:rPr>
+        <w:t xml:space="preserve"> .Net / Angular</w:t>
       </w:r>
       <w:r>
         <w:rPr>
@@ -1357,7 +1417,51 @@
           <w:sz w:val="20"/>
           <w:szCs w:val="20"/>
         </w:rPr>
-        <w:t>Desarrollo de APIs RESTful con .NET Framework, exponiendo servicios consumidos por módulos Angular con arquitectura por componentes.</w:t>
+        <w:t xml:space="preserve">Desarrollo de </w:t>
+      </w:r>
+      <w:proofErr w:type="spellStart"/>
+      <w:r>
+        <w:rPr>
+          <w:rFonts w:ascii="Tahoma" w:eastAsia="Tahoma" w:hAnsi="Tahoma" w:cs="Tahoma"/>
+          <w:bCs/>
+          <w:iCs/>
+          <w:sz w:val="20"/>
+          <w:szCs w:val="20"/>
+        </w:rPr>
+        <w:t>APIs</w:t>
+      </w:r>
+      <w:proofErr w:type="spellEnd"/>
+      <w:r>
+        <w:rPr>
+          <w:rFonts w:ascii="Tahoma" w:eastAsia="Tahoma" w:hAnsi="Tahoma" w:cs="Tahoma"/>
+          <w:bCs/>
+          <w:iCs/>
+          <w:sz w:val="20"/>
+          <w:szCs w:val="20"/>
+        </w:rPr>
+        <w:t xml:space="preserve"> </w:t>
+      </w:r>
+      <w:proofErr w:type="spellStart"/>
+      <w:r>
+        <w:rPr>
+          <w:rFonts w:ascii="Tahoma" w:eastAsia="Tahoma" w:hAnsi="Tahoma" w:cs="Tahoma"/>
+          <w:bCs/>
+          <w:iCs/>
+          <w:sz w:val="20"/>
+          <w:szCs w:val="20"/>
+        </w:rPr>
+        <w:t>RESTful</w:t>
+      </w:r>
+      <w:proofErr w:type="spellEnd"/>
+      <w:r>
+        <w:rPr>
+          <w:rFonts w:ascii="Tahoma" w:eastAsia="Tahoma" w:hAnsi="Tahoma" w:cs="Tahoma"/>
+          <w:bCs/>
+          <w:iCs/>
+          <w:sz w:val="20"/>
+          <w:szCs w:val="20"/>
+        </w:rPr>
+        <w:t xml:space="preserve"> con .NET Framework, exponiendo servicios consumidos por módulos Angular con arquitectura por componentes.</w:t>
       </w:r>
     </w:p>
     <w:p>
@@ -1383,7 +1487,73 @@
           <w:sz w:val="20"/>
           <w:szCs w:val="20"/>
         </w:rPr>
-        <w:t>Modelado y administración de base de datos Oracle: diseño de esquemas, stored procedures y packages para encapsular lógica de negocio compleja.</w:t>
+        <w:t xml:space="preserve">Modelado y administración de base de datos Oracle: diseño de esquemas, </w:t>
+      </w:r>
+      <w:proofErr w:type="spellStart"/>
+      <w:r>
+        <w:rPr>
+          <w:rFonts w:ascii="Tahoma" w:eastAsia="Tahoma" w:hAnsi="Tahoma" w:cs="Tahoma"/>
+          <w:bCs/>
+          <w:iCs/>
+          <w:sz w:val="20"/>
+          <w:szCs w:val="20"/>
+        </w:rPr>
+        <w:t>stored</w:t>
+      </w:r>
+      <w:proofErr w:type="spellEnd"/>
+      <w:r>
+        <w:rPr>
+          <w:rFonts w:ascii="Tahoma" w:eastAsia="Tahoma" w:hAnsi="Tahoma" w:cs="Tahoma"/>
+          <w:bCs/>
+          <w:iCs/>
+          <w:sz w:val="20"/>
+          <w:szCs w:val="20"/>
+        </w:rPr>
+        <w:t xml:space="preserve"> </w:t>
+      </w:r>
+      <w:proofErr w:type="spellStart"/>
+      <w:r>
+        <w:rPr>
+          <w:rFonts w:ascii="Tahoma" w:eastAsia="Tahoma" w:hAnsi="Tahoma" w:cs="Tahoma"/>
+          <w:bCs/>
+          <w:iCs/>
+          <w:sz w:val="20"/>
+          <w:szCs w:val="20"/>
+        </w:rPr>
+        <w:t>procedures</w:t>
+      </w:r>
+      <w:proofErr w:type="spellEnd"/>
+      <w:r>
+        <w:rPr>
+          <w:rFonts w:ascii="Tahoma" w:eastAsia="Tahoma" w:hAnsi="Tahoma" w:cs="Tahoma"/>
+          <w:bCs/>
+          <w:iCs/>
+          <w:sz w:val="20"/>
+          <w:szCs w:val="20"/>
+        </w:rPr>
+        <w:t xml:space="preserve"> y </w:t>
+      </w:r>
+      <w:proofErr w:type="spellStart"/>
+      <w:r>
+        <w:rPr>
+          <w:rFonts w:ascii="Tahoma" w:eastAsia="Tahoma" w:hAnsi="Tahoma" w:cs="Tahoma"/>
+          <w:bCs/>
+          <w:iCs/>
+          <w:sz w:val="20"/>
+          <w:szCs w:val="20"/>
+        </w:rPr>
+        <w:t>packages</w:t>
+      </w:r>
+      <w:proofErr w:type="spellEnd"/>
+      <w:r>
+        <w:rPr>
+          <w:rFonts w:ascii="Tahoma" w:eastAsia="Tahoma" w:hAnsi="Tahoma" w:cs="Tahoma"/>
+          <w:bCs/>
+          <w:iCs/>
+          <w:sz w:val="20"/>
+          <w:szCs w:val="20"/>
+        </w:rPr>
+        <w:t xml:space="preserve"> para encapsular lógica de negocio compleja.</w:t>
       </w:r>
     </w:p>
     <w:p>
@@ -1409,7 +1579,29 @@
           <w:sz w:val="20"/>
           <w:szCs w:val="20"/>
         </w:rPr>
-        <w:t>Construcción de vistas y flujos de usuario en Angular, integrando servicios HTTP y manejo reactivo de estado con RxJS.</w:t>
+        <w:t xml:space="preserve">Construcción de vistas y flujos de usuario en Angular, integrando servicios HTTP y manejo reactivo de estado con </w:t>
+      </w:r>
+      <w:proofErr w:type="spellStart"/>
+      <w:r>
+        <w:rPr>
+          <w:rFonts w:ascii="Tahoma" w:eastAsia="Tahoma" w:hAnsi="Tahoma" w:cs="Tahoma"/>
+          <w:bCs/>
+          <w:iCs/>
+          <w:sz w:val="20"/>
+          <w:szCs w:val="20"/>
+        </w:rPr>
+        <w:t>RxJS</w:t>
+      </w:r>
+      <w:proofErr w:type="spellEnd"/>
+      <w:r>
+        <w:rPr>
+          <w:rFonts w:ascii="Tahoma" w:eastAsia="Tahoma" w:hAnsi="Tahoma" w:cs="Tahoma"/>
+          <w:bCs/>
+          <w:iCs/>
+          <w:sz w:val="20"/>
+          <w:szCs w:val="20"/>
+        </w:rPr>
+        <w:t>.</w:t>
       </w:r>
     </w:p>
     <w:p>
@@ -1435,7 +1627,29 @@
           <w:sz w:val="20"/>
           <w:szCs w:val="20"/>
         </w:rPr>
-        <w:t>Implementación de capas de acceso a datos con llamadas a procedures Oracle, garantizando trazabilidad y separación de responsabilidades.</w:t>
+        <w:t xml:space="preserve">Implementación de capas de acceso a datos con llamadas a </w:t>
+      </w:r>
+      <w:proofErr w:type="spellStart"/>
+      <w:r>
+        <w:rPr>
+          <w:rFonts w:ascii="Tahoma" w:eastAsia="Tahoma" w:hAnsi="Tahoma" w:cs="Tahoma"/>
+          <w:bCs/>
+          <w:iCs/>
+          <w:sz w:val="20"/>
+          <w:szCs w:val="20"/>
+        </w:rPr>
+        <w:t>procedures</w:t>
+      </w:r>
+      <w:proofErr w:type="spellEnd"/>
+      <w:r>
+        <w:rPr>
+          <w:rFonts w:ascii="Tahoma" w:eastAsia="Tahoma" w:hAnsi="Tahoma" w:cs="Tahoma"/>
+          <w:bCs/>
+          <w:iCs/>
+          <w:sz w:val="20"/>
+          <w:szCs w:val="20"/>
+        </w:rPr>
+        <w:t xml:space="preserve"> Oracle, garantizando trazabilidad y separación de responsabilidades.</w:t>
       </w:r>
     </w:p>
     <w:p>
@@ -1503,8 +1717,20 @@
           <w:sz w:val="20"/>
           <w:szCs w:val="20"/>
         </w:rPr>
-        <w:t xml:space="preserve"> / Coforge</w:t>
-      </w:r>
+        <w:t xml:space="preserve"> / </w:t>
+      </w:r>
+      <w:proofErr w:type="spellStart"/>
+      <w:r>
+        <w:rPr>
+          <w:rFonts w:ascii="Tahoma" w:eastAsia="Tahoma" w:hAnsi="Tahoma" w:cs="Tahoma"/>
+          <w:b/>
+          <w:iCs/>
+          <w:sz w:val="20"/>
+          <w:szCs w:val="20"/>
+        </w:rPr>
+        <w:t>Coforge</w:t>
+      </w:r>
+      <w:proofErr w:type="spellEnd"/>
       <w:r>
         <w:rPr>
           <w:rFonts w:ascii="Tahoma" w:eastAsia="Tahoma" w:hAnsi="Tahoma" w:cs="Tahoma"/>
@@ -1646,7 +1872,29 @@
           <w:sz w:val="20"/>
           <w:szCs w:val="20"/>
         </w:rPr>
-        <w:t>Diseño de APIs bajo enfoque API-First, definiendo contratos desacoplados entre dominios.</w:t>
+        <w:t xml:space="preserve">Diseño de </w:t>
+      </w:r>
+      <w:proofErr w:type="spellStart"/>
+      <w:r>
+        <w:rPr>
+          <w:rFonts w:ascii="Tahoma" w:eastAsia="Tahoma" w:hAnsi="Tahoma" w:cs="Tahoma"/>
+          <w:bCs/>
+          <w:iCs/>
+          <w:sz w:val="20"/>
+          <w:szCs w:val="20"/>
+        </w:rPr>
+        <w:t>APIs</w:t>
+      </w:r>
+      <w:proofErr w:type="spellEnd"/>
+      <w:r>
+        <w:rPr>
+          <w:rFonts w:ascii="Tahoma" w:eastAsia="Tahoma" w:hAnsi="Tahoma" w:cs="Tahoma"/>
+          <w:bCs/>
+          <w:iCs/>
+          <w:sz w:val="20"/>
+          <w:szCs w:val="20"/>
+        </w:rPr>
+        <w:t xml:space="preserve"> bajo enfoque API-First, definiendo contratos desacoplados entre dominios.</w:t>
       </w:r>
     </w:p>
     <w:p>
@@ -1700,7 +1948,51 @@
           <w:sz w:val="20"/>
           <w:szCs w:val="20"/>
         </w:rPr>
-        <w:t>Implementación de prácticas DevOps avanzadas: ambientes efímeros y Feature Flags para despliegues progresivos.</w:t>
+        <w:t xml:space="preserve">Implementación de prácticas DevOps avanzadas: ambientes efímeros y </w:t>
+      </w:r>
+      <w:proofErr w:type="spellStart"/>
+      <w:r>
+        <w:rPr>
+          <w:rFonts w:ascii="Tahoma" w:eastAsia="Tahoma" w:hAnsi="Tahoma" w:cs="Tahoma"/>
+          <w:bCs/>
+          <w:iCs/>
+          <w:sz w:val="20"/>
+          <w:szCs w:val="20"/>
+        </w:rPr>
+        <w:t>Feature</w:t>
+      </w:r>
+      <w:proofErr w:type="spellEnd"/>
+      <w:r>
+        <w:rPr>
+          <w:rFonts w:ascii="Tahoma" w:eastAsia="Tahoma" w:hAnsi="Tahoma" w:cs="Tahoma"/>
+          <w:bCs/>
+          <w:iCs/>
+          <w:sz w:val="20"/>
+          <w:szCs w:val="20"/>
+        </w:rPr>
+        <w:t xml:space="preserve"> </w:t>
+      </w:r>
+      <w:proofErr w:type="spellStart"/>
+      <w:r>
+        <w:rPr>
+          <w:rFonts w:ascii="Tahoma" w:eastAsia="Tahoma" w:hAnsi="Tahoma" w:cs="Tahoma"/>
+          <w:bCs/>
+          <w:iCs/>
+          <w:sz w:val="20"/>
+          <w:szCs w:val="20"/>
+        </w:rPr>
+        <w:t>Flags</w:t>
+      </w:r>
+      <w:proofErr w:type="spellEnd"/>
+      <w:r>
+        <w:rPr>
+          <w:rFonts w:ascii="Tahoma" w:eastAsia="Tahoma" w:hAnsi="Tahoma" w:cs="Tahoma"/>
+          <w:bCs/>
+          <w:iCs/>
+          <w:sz w:val="20"/>
+          <w:szCs w:val="20"/>
+        </w:rPr>
+        <w:t xml:space="preserve"> para despliegues progresivos.</w:t>
       </w:r>
     </w:p>
     <w:p>
@@ -1727,7 +2019,29 @@
           <w:sz w:val="20"/>
           <w:szCs w:val="20"/>
         </w:rPr>
-        <w:t>Integración asincrónica con Azure Queues, aplicando patrones de resiliencia.</w:t>
+        <w:t xml:space="preserve">Integración asincrónica con Azure </w:t>
+      </w:r>
+      <w:proofErr w:type="spellStart"/>
+      <w:r>
+        <w:rPr>
+          <w:rFonts w:ascii="Tahoma" w:eastAsia="Tahoma" w:hAnsi="Tahoma" w:cs="Tahoma"/>
+          <w:bCs/>
+          <w:iCs/>
+          <w:sz w:val="20"/>
+          <w:szCs w:val="20"/>
+        </w:rPr>
+        <w:t>Queues</w:t>
+      </w:r>
+      <w:proofErr w:type="spellEnd"/>
+      <w:r>
+        <w:rPr>
+          <w:rFonts w:ascii="Tahoma" w:eastAsia="Tahoma" w:hAnsi="Tahoma" w:cs="Tahoma"/>
+          <w:bCs/>
+          <w:iCs/>
+          <w:sz w:val="20"/>
+          <w:szCs w:val="20"/>
+        </w:rPr>
+        <w:t>, aplicando patrones de resiliencia.</w:t>
       </w:r>
     </w:p>
     <w:p>
@@ -1754,7 +2068,29 @@
           <w:sz w:val="20"/>
           <w:szCs w:val="20"/>
         </w:rPr>
-        <w:t>Implementación de observabilidad y monitoreo con Azure API Management, Dynatrace y Grafana.</w:t>
+        <w:t xml:space="preserve">Implementación de observabilidad y monitoreo con Azure API Management, </w:t>
+      </w:r>
+      <w:proofErr w:type="spellStart"/>
+      <w:r>
+        <w:rPr>
+          <w:rFonts w:ascii="Tahoma" w:eastAsia="Tahoma" w:hAnsi="Tahoma" w:cs="Tahoma"/>
+          <w:bCs/>
+          <w:iCs/>
+          <w:sz w:val="20"/>
+          <w:szCs w:val="20"/>
+        </w:rPr>
+        <w:t>Dynatrace</w:t>
+      </w:r>
+      <w:proofErr w:type="spellEnd"/>
+      <w:r>
+        <w:rPr>
+          <w:rFonts w:ascii="Tahoma" w:eastAsia="Tahoma" w:hAnsi="Tahoma" w:cs="Tahoma"/>
+          <w:bCs/>
+          <w:iCs/>
+          <w:sz w:val="20"/>
+          <w:szCs w:val="20"/>
+        </w:rPr>
+        <w:t xml:space="preserve"> y Grafana.</w:t>
       </w:r>
     </w:p>
     <w:p>
@@ -2007,7 +2343,29 @@
           <w:sz w:val="20"/>
           <w:szCs w:val="20"/>
         </w:rPr>
-        <w:t>Integración con Azure Queues y Azure Data Factory (ADF).</w:t>
+        <w:t xml:space="preserve">Integración con Azure </w:t>
+      </w:r>
+      <w:proofErr w:type="spellStart"/>
+      <w:r>
+        <w:rPr>
+          <w:rFonts w:ascii="Tahoma" w:eastAsia="Tahoma" w:hAnsi="Tahoma" w:cs="Tahoma"/>
+          <w:bCs/>
+          <w:iCs/>
+          <w:sz w:val="20"/>
+          <w:szCs w:val="20"/>
+        </w:rPr>
+        <w:t>Queues</w:t>
+      </w:r>
+      <w:proofErr w:type="spellEnd"/>
+      <w:r>
+        <w:rPr>
+          <w:rFonts w:ascii="Tahoma" w:eastAsia="Tahoma" w:hAnsi="Tahoma" w:cs="Tahoma"/>
+          <w:bCs/>
+          <w:iCs/>
+          <w:sz w:val="20"/>
+          <w:szCs w:val="20"/>
+        </w:rPr>
+        <w:t xml:space="preserve"> y Azure Data Factory (ADF).</w:t>
       </w:r>
     </w:p>
     <w:p>
@@ -2034,7 +2392,29 @@
           <w:sz w:val="20"/>
           <w:szCs w:val="20"/>
         </w:rPr>
-        <w:t>Implementación de APIs bajo enfoque API-First.</w:t>
+        <w:t xml:space="preserve">Implementación de </w:t>
+      </w:r>
+      <w:proofErr w:type="spellStart"/>
+      <w:r>
+        <w:rPr>
+          <w:rFonts w:ascii="Tahoma" w:eastAsia="Tahoma" w:hAnsi="Tahoma" w:cs="Tahoma"/>
+          <w:bCs/>
+          <w:iCs/>
+          <w:sz w:val="20"/>
+          <w:szCs w:val="20"/>
+        </w:rPr>
+        <w:t>APIs</w:t>
+      </w:r>
+      <w:proofErr w:type="spellEnd"/>
+      <w:r>
+        <w:rPr>
+          <w:rFonts w:ascii="Tahoma" w:eastAsia="Tahoma" w:hAnsi="Tahoma" w:cs="Tahoma"/>
+          <w:bCs/>
+          <w:iCs/>
+          <w:sz w:val="20"/>
+          <w:szCs w:val="20"/>
+        </w:rPr>
+        <w:t xml:space="preserve"> bajo enfoque API-First.</w:t>
       </w:r>
     </w:p>
     <w:p>
@@ -2061,7 +2441,29 @@
           <w:sz w:val="20"/>
           <w:szCs w:val="20"/>
         </w:rPr>
-        <w:t>Monitoreo y análisis de métricas mediante Dynatrace y Grafana.</w:t>
+        <w:t xml:space="preserve">Monitoreo y análisis de métricas mediante </w:t>
+      </w:r>
+      <w:proofErr w:type="spellStart"/>
+      <w:r>
+        <w:rPr>
+          <w:rFonts w:ascii="Tahoma" w:eastAsia="Tahoma" w:hAnsi="Tahoma" w:cs="Tahoma"/>
+          <w:bCs/>
+          <w:iCs/>
+          <w:sz w:val="20"/>
+          <w:szCs w:val="20"/>
+        </w:rPr>
+        <w:t>Dynatrace</w:t>
+      </w:r>
+      <w:proofErr w:type="spellEnd"/>
+      <w:r>
+        <w:rPr>
+          <w:rFonts w:ascii="Tahoma" w:eastAsia="Tahoma" w:hAnsi="Tahoma" w:cs="Tahoma"/>
+          <w:bCs/>
+          <w:iCs/>
+          <w:sz w:val="20"/>
+          <w:szCs w:val="20"/>
+        </w:rPr>
+        <w:t xml:space="preserve"> y Grafana.</w:t>
       </w:r>
     </w:p>
     <w:p>
@@ -2145,7 +2547,31 @@
           <w:szCs w:val="20"/>
         </w:rPr>
         <w:br/>
-        <w:t>Full Stack Developer Java – Angular JS</w:t>
+        <w:t xml:space="preserve">Full Stack </w:t>
+      </w:r>
+      <w:proofErr w:type="spellStart"/>
+      <w:r>
+        <w:rPr>
+          <w:rFonts w:ascii="Tahoma" w:eastAsia="Tahoma" w:hAnsi="Tahoma" w:cs="Tahoma"/>
+          <w:b/>
+          <w:bCs/>
+          <w:iCs/>
+          <w:sz w:val="20"/>
+          <w:szCs w:val="20"/>
+        </w:rPr>
+        <w:t>Developer</w:t>
+      </w:r>
+      <w:proofErr w:type="spellEnd"/>
+      <w:r>
+        <w:rPr>
+          <w:rFonts w:ascii="Tahoma" w:eastAsia="Tahoma" w:hAnsi="Tahoma" w:cs="Tahoma"/>
+          <w:b/>
+          <w:bCs/>
+          <w:iCs/>
+          <w:sz w:val="20"/>
+          <w:szCs w:val="20"/>
+        </w:rPr>
+        <w:t xml:space="preserve"> Java – Angular JS</w:t>
       </w:r>
       <w:r>
         <w:rPr>
@@ -2247,7 +2673,51 @@
           <w:sz w:val="20"/>
           <w:szCs w:val="20"/>
         </w:rPr>
-        <w:t>Implementación de estrategia de calidad mediante pruebas unitarias y de integración (JUnit, Mockito, Jasmine, Karma).</w:t>
+        <w:t>Implementación de estrategia de calidad mediante pruebas unitarias y de integración (</w:t>
+      </w:r>
+      <w:proofErr w:type="spellStart"/>
+      <w:r>
+        <w:rPr>
+          <w:rFonts w:ascii="Tahoma" w:eastAsia="Tahoma" w:hAnsi="Tahoma" w:cs="Tahoma"/>
+          <w:bCs/>
+          <w:iCs/>
+          <w:sz w:val="20"/>
+          <w:szCs w:val="20"/>
+        </w:rPr>
+        <w:t>JUnit</w:t>
+      </w:r>
+      <w:proofErr w:type="spellEnd"/>
+      <w:r>
+        <w:rPr>
+          <w:rFonts w:ascii="Tahoma" w:eastAsia="Tahoma" w:hAnsi="Tahoma" w:cs="Tahoma"/>
+          <w:bCs/>
+          <w:iCs/>
+          <w:sz w:val="20"/>
+          <w:szCs w:val="20"/>
+        </w:rPr>
+        <w:t xml:space="preserve">, </w:t>
+      </w:r>
+      <w:proofErr w:type="spellStart"/>
+      <w:r>
+        <w:rPr>
+          <w:rFonts w:ascii="Tahoma" w:eastAsia="Tahoma" w:hAnsi="Tahoma" w:cs="Tahoma"/>
+          <w:bCs/>
+          <w:iCs/>
+          <w:sz w:val="20"/>
+          <w:szCs w:val="20"/>
+        </w:rPr>
+        <w:t>Mockito</w:t>
+      </w:r>
+      <w:proofErr w:type="spellEnd"/>
+      <w:r>
+        <w:rPr>
+          <w:rFonts w:ascii="Tahoma" w:eastAsia="Tahoma" w:hAnsi="Tahoma" w:cs="Tahoma"/>
+          <w:bCs/>
+          <w:iCs/>
+          <w:sz w:val="20"/>
+          <w:szCs w:val="20"/>
+        </w:rPr>
+        <w:t>, Jasmine, Karma).</w:t>
       </w:r>
     </w:p>
     <w:p>
@@ -2279,7 +2749,29 @@
           <w:sz w:val="20"/>
           <w:szCs w:val="20"/>
         </w:rPr>
-        <w:t>Integración con ecosistema AWS (Cognito, SES, SNS) para autenticación y mensajería distribuida.</w:t>
+        <w:t>Integración con ecosistema AWS (</w:t>
+      </w:r>
+      <w:proofErr w:type="spellStart"/>
+      <w:r>
+        <w:rPr>
+          <w:rFonts w:ascii="Tahoma" w:eastAsia="Tahoma" w:hAnsi="Tahoma" w:cs="Tahoma"/>
+          <w:bCs/>
+          <w:iCs/>
+          <w:sz w:val="20"/>
+          <w:szCs w:val="20"/>
+        </w:rPr>
+        <w:t>Cognito</w:t>
+      </w:r>
+      <w:proofErr w:type="spellEnd"/>
+      <w:r>
+        <w:rPr>
+          <w:rFonts w:ascii="Tahoma" w:eastAsia="Tahoma" w:hAnsi="Tahoma" w:cs="Tahoma"/>
+          <w:bCs/>
+          <w:iCs/>
+          <w:sz w:val="20"/>
+          <w:szCs w:val="20"/>
+        </w:rPr>
+        <w:t>, SES, SNS) para autenticación y mensajería distribuida.</w:t>
       </w:r>
     </w:p>
     <w:p>
@@ -2311,7 +2803,29 @@
           <w:sz w:val="20"/>
           <w:szCs w:val="20"/>
         </w:rPr>
-        <w:t>Gestión de despliegues y observabilidad en entornos AWS, utilizando CloudWatch para monitoreo y análisis de métricas.</w:t>
+        <w:t xml:space="preserve">Gestión de despliegues y observabilidad en entornos AWS, utilizando </w:t>
+      </w:r>
+      <w:proofErr w:type="spellStart"/>
+      <w:r>
+        <w:rPr>
+          <w:rFonts w:ascii="Tahoma" w:eastAsia="Tahoma" w:hAnsi="Tahoma" w:cs="Tahoma"/>
+          <w:bCs/>
+          <w:iCs/>
+          <w:sz w:val="20"/>
+          <w:szCs w:val="20"/>
+        </w:rPr>
+        <w:t>CloudWatch</w:t>
+      </w:r>
+      <w:proofErr w:type="spellEnd"/>
+      <w:r>
+        <w:rPr>
+          <w:rFonts w:ascii="Tahoma" w:eastAsia="Tahoma" w:hAnsi="Tahoma" w:cs="Tahoma"/>
+          <w:bCs/>
+          <w:iCs/>
+          <w:sz w:val="20"/>
+          <w:szCs w:val="20"/>
+        </w:rPr>
+        <w:t xml:space="preserve"> para monitoreo y análisis de métricas.</w:t>
       </w:r>
     </w:p>
     <w:p>
@@ -2353,7 +2867,29 @@
           <w:sz w:val="20"/>
           <w:szCs w:val="20"/>
         </w:rPr>
-        <w:t>MDP Consulting, Lima, Perú</w:t>
+        <w:t xml:space="preserve">MDP </w:t>
+      </w:r>
+      <w:proofErr w:type="spellStart"/>
+      <w:r>
+        <w:rPr>
+          <w:rFonts w:ascii="Tahoma" w:eastAsia="Tahoma" w:hAnsi="Tahoma" w:cs="Tahoma"/>
+          <w:b/>
+          <w:iCs/>
+          <w:sz w:val="20"/>
+          <w:szCs w:val="20"/>
+        </w:rPr>
+        <w:t>Consulting</w:t>
+      </w:r>
+      <w:proofErr w:type="spellEnd"/>
+      <w:r>
+        <w:rPr>
+          <w:rFonts w:ascii="Tahoma" w:eastAsia="Tahoma" w:hAnsi="Tahoma" w:cs="Tahoma"/>
+          <w:b/>
+          <w:iCs/>
+          <w:sz w:val="20"/>
+          <w:szCs w:val="20"/>
+        </w:rPr>
+        <w:t>, Lima, Perú</w:t>
       </w:r>
     </w:p>
     <w:p>
@@ -2421,18 +2957,89 @@
           <w:szCs w:val="20"/>
         </w:rPr>
         <w:br/>
-        <w:t>FullStack Developer Java – Angular JS</w:t>
-      </w:r>
-      <w:r>
-        <w:rPr>
-          <w:rFonts w:ascii="Tahoma" w:eastAsia="Tahoma" w:hAnsi="Tahoma" w:cs="Tahoma"/>
-          <w:b/>
-          <w:bCs/>
-          <w:iCs/>
-          <w:sz w:val="20"/>
-          <w:szCs w:val="20"/>
-        </w:rPr>
-        <w:t xml:space="preserve"> – React - RPA</w:t>
+      </w:r>
+      <w:proofErr w:type="spellStart"/>
+      <w:r>
+        <w:rPr>
+          <w:rFonts w:ascii="Tahoma" w:eastAsia="Tahoma" w:hAnsi="Tahoma" w:cs="Tahoma"/>
+          <w:b/>
+          <w:bCs/>
+          <w:iCs/>
+          <w:sz w:val="20"/>
+          <w:szCs w:val="20"/>
+        </w:rPr>
+        <w:t>FullStack</w:t>
+      </w:r>
+      <w:proofErr w:type="spellEnd"/>
+      <w:r>
+        <w:rPr>
+          <w:rFonts w:ascii="Tahoma" w:eastAsia="Tahoma" w:hAnsi="Tahoma" w:cs="Tahoma"/>
+          <w:b/>
+          <w:bCs/>
+          <w:iCs/>
+          <w:sz w:val="20"/>
+          <w:szCs w:val="20"/>
+        </w:rPr>
+        <w:t xml:space="preserve"> </w:t>
+      </w:r>
+      <w:proofErr w:type="spellStart"/>
+      <w:r>
+        <w:rPr>
+          <w:rFonts w:ascii="Tahoma" w:eastAsia="Tahoma" w:hAnsi="Tahoma" w:cs="Tahoma"/>
+          <w:b/>
+          <w:bCs/>
+          <w:iCs/>
+          <w:sz w:val="20"/>
+          <w:szCs w:val="20"/>
+        </w:rPr>
+        <w:t>Developer</w:t>
+      </w:r>
+      <w:proofErr w:type="spellEnd"/>
+      <w:r>
+        <w:rPr>
+          <w:rFonts w:ascii="Tahoma" w:eastAsia="Tahoma" w:hAnsi="Tahoma" w:cs="Tahoma"/>
+          <w:b/>
+          <w:bCs/>
+          <w:iCs/>
+          <w:sz w:val="20"/>
+          <w:szCs w:val="20"/>
+        </w:rPr>
+        <w:t xml:space="preserve"> Java – Angular JS</w:t>
+      </w:r>
+      <w:r>
+        <w:rPr>
+          <w:rFonts w:ascii="Tahoma" w:eastAsia="Tahoma" w:hAnsi="Tahoma" w:cs="Tahoma"/>
+          <w:b/>
+          <w:bCs/>
+          <w:iCs/>
+          <w:sz w:val="20"/>
+          <w:szCs w:val="20"/>
+        </w:rPr>
+        <w:t xml:space="preserve"> – </w:t>
+      </w:r>
+      <w:proofErr w:type="spellStart"/>
+      <w:r>
+        <w:rPr>
+          <w:rFonts w:ascii="Tahoma" w:eastAsia="Tahoma" w:hAnsi="Tahoma" w:cs="Tahoma"/>
+          <w:b/>
+          <w:bCs/>
+          <w:iCs/>
+          <w:sz w:val="20"/>
+          <w:szCs w:val="20"/>
+        </w:rPr>
+        <w:t>React</w:t>
+      </w:r>
+      <w:proofErr w:type="spellEnd"/>
+      <w:r>
+        <w:rPr>
+          <w:rFonts w:ascii="Tahoma" w:eastAsia="Tahoma" w:hAnsi="Tahoma" w:cs="Tahoma"/>
+          <w:b/>
+          <w:bCs/>
+          <w:iCs/>
+          <w:sz w:val="20"/>
+          <w:szCs w:val="20"/>
+        </w:rPr>
+        <w:t xml:space="preserve"> - RPA</w:t>
       </w:r>
       <w:r>
         <w:rPr>
@@ -2538,7 +3145,27 @@
           <w:sz w:val="20"/>
           <w:szCs w:val="20"/>
         </w:rPr>
-        <w:t>Desarrollo frontend con Angular (Redeban) y React (Pacífico).</w:t>
+        <w:t xml:space="preserve">Desarrollo frontend con Angular (Redeban) y </w:t>
+      </w:r>
+      <w:proofErr w:type="spellStart"/>
+      <w:r>
+        <w:rPr>
+          <w:rFonts w:ascii="Tahoma" w:eastAsia="Tahoma" w:hAnsi="Tahoma" w:cs="Tahoma"/>
+          <w:iCs/>
+          <w:sz w:val="20"/>
+          <w:szCs w:val="20"/>
+        </w:rPr>
+        <w:t>React</w:t>
+      </w:r>
+      <w:proofErr w:type="spellEnd"/>
+      <w:r>
+        <w:rPr>
+          <w:rFonts w:ascii="Tahoma" w:eastAsia="Tahoma" w:hAnsi="Tahoma" w:cs="Tahoma"/>
+          <w:iCs/>
+          <w:sz w:val="20"/>
+          <w:szCs w:val="20"/>
+        </w:rPr>
+        <w:t xml:space="preserve"> (Pacífico).</w:t>
       </w:r>
     </w:p>
     <w:p>
@@ -2588,7 +3215,27 @@
           <w:sz w:val="20"/>
           <w:szCs w:val="20"/>
         </w:rPr>
-        <w:t>Integración con servicios AWS y despliegue monitoreado con CloudWatch.</w:t>
+        <w:t xml:space="preserve">Integración con servicios AWS y despliegue monitoreado con </w:t>
+      </w:r>
+      <w:proofErr w:type="spellStart"/>
+      <w:r>
+        <w:rPr>
+          <w:rFonts w:ascii="Tahoma" w:eastAsia="Tahoma" w:hAnsi="Tahoma" w:cs="Tahoma"/>
+          <w:iCs/>
+          <w:sz w:val="20"/>
+          <w:szCs w:val="20"/>
+        </w:rPr>
+        <w:t>CloudWatch</w:t>
+      </w:r>
+      <w:proofErr w:type="spellEnd"/>
+      <w:r>
+        <w:rPr>
+          <w:rFonts w:ascii="Tahoma" w:eastAsia="Tahoma" w:hAnsi="Tahoma" w:cs="Tahoma"/>
+          <w:iCs/>
+          <w:sz w:val="20"/>
+          <w:szCs w:val="20"/>
+        </w:rPr>
+        <w:t>.</w:t>
       </w:r>
     </w:p>
     <w:p>
@@ -2613,7 +3260,27 @@
           <w:sz w:val="20"/>
           <w:szCs w:val="20"/>
         </w:rPr>
-        <w:t>Automatización de procesos empresariales con UiPath, implementando manejo de colas y control de excepciones.</w:t>
+        <w:t xml:space="preserve">Automatización de procesos empresariales con </w:t>
+      </w:r>
+      <w:proofErr w:type="spellStart"/>
+      <w:r>
+        <w:rPr>
+          <w:rFonts w:ascii="Tahoma" w:eastAsia="Tahoma" w:hAnsi="Tahoma" w:cs="Tahoma"/>
+          <w:iCs/>
+          <w:sz w:val="20"/>
+          <w:szCs w:val="20"/>
+        </w:rPr>
+        <w:t>UiPath</w:t>
+      </w:r>
+      <w:proofErr w:type="spellEnd"/>
+      <w:r>
+        <w:rPr>
+          <w:rFonts w:ascii="Tahoma" w:eastAsia="Tahoma" w:hAnsi="Tahoma" w:cs="Tahoma"/>
+          <w:iCs/>
+          <w:sz w:val="20"/>
+          <w:szCs w:val="20"/>
+        </w:rPr>
+        <w:t>, implementando manejo de colas y control de excepciones.</w:t>
       </w:r>
     </w:p>
     <w:p>
@@ -2661,7 +3328,54 @@
           <w:szCs w:val="20"/>
         </w:rPr>
         <w:br/>
-        <w:t>FullStack Developer PHP – Angular JS</w:t>
+      </w:r>
+      <w:proofErr w:type="spellStart"/>
+      <w:r>
+        <w:rPr>
+          <w:rFonts w:ascii="Tahoma" w:eastAsia="Tahoma" w:hAnsi="Tahoma" w:cs="Tahoma"/>
+          <w:b/>
+          <w:bCs/>
+          <w:iCs/>
+          <w:sz w:val="20"/>
+          <w:szCs w:val="20"/>
+        </w:rPr>
+        <w:t>FullStack</w:t>
+      </w:r>
+      <w:proofErr w:type="spellEnd"/>
+      <w:r>
+        <w:rPr>
+          <w:rFonts w:ascii="Tahoma" w:eastAsia="Tahoma" w:hAnsi="Tahoma" w:cs="Tahoma"/>
+          <w:b/>
+          <w:bCs/>
+          <w:iCs/>
+          <w:sz w:val="20"/>
+          <w:szCs w:val="20"/>
+        </w:rPr>
+        <w:t xml:space="preserve"> </w:t>
+      </w:r>
+      <w:proofErr w:type="spellStart"/>
+      <w:r>
+        <w:rPr>
+          <w:rFonts w:ascii="Tahoma" w:eastAsia="Tahoma" w:hAnsi="Tahoma" w:cs="Tahoma"/>
+          <w:b/>
+          <w:bCs/>
+          <w:iCs/>
+          <w:sz w:val="20"/>
+          <w:szCs w:val="20"/>
+        </w:rPr>
+        <w:t>Developer</w:t>
+      </w:r>
+      <w:proofErr w:type="spellEnd"/>
+      <w:r>
+        <w:rPr>
+          <w:rFonts w:ascii="Tahoma" w:eastAsia="Tahoma" w:hAnsi="Tahoma" w:cs="Tahoma"/>
+          <w:b/>
+          <w:bCs/>
+          <w:iCs/>
+          <w:sz w:val="20"/>
+          <w:szCs w:val="20"/>
+        </w:rPr>
+        <w:t xml:space="preserve"> PHP – Angular JS</w:t>
       </w:r>
       <w:r>
         <w:rPr>
@@ -2717,7 +3431,29 @@
           <w:sz w:val="20"/>
           <w:szCs w:val="20"/>
         </w:rPr>
-        <w:t>Desarrollo backend con Symfony (PHP) bajo arquitectura modular y buenas prácticas de programación.</w:t>
+        <w:t xml:space="preserve">Desarrollo backend con </w:t>
+      </w:r>
+      <w:proofErr w:type="spellStart"/>
+      <w:r>
+        <w:rPr>
+          <w:rFonts w:ascii="Tahoma" w:eastAsia="Tahoma" w:hAnsi="Tahoma" w:cs="Tahoma"/>
+          <w:bCs/>
+          <w:iCs/>
+          <w:sz w:val="20"/>
+          <w:szCs w:val="20"/>
+        </w:rPr>
+        <w:t>Symfony</w:t>
+      </w:r>
+      <w:proofErr w:type="spellEnd"/>
+      <w:r>
+        <w:rPr>
+          <w:rFonts w:ascii="Tahoma" w:eastAsia="Tahoma" w:hAnsi="Tahoma" w:cs="Tahoma"/>
+          <w:bCs/>
+          <w:iCs/>
+          <w:sz w:val="20"/>
+          <w:szCs w:val="20"/>
+        </w:rPr>
+        <w:t xml:space="preserve"> (PHP) bajo arquitectura modular y buenas prácticas de programación.</w:t>
       </w:r>
     </w:p>
     <w:p>
@@ -2744,7 +3480,29 @@
           <w:sz w:val="20"/>
           <w:szCs w:val="20"/>
         </w:rPr>
-        <w:t>Desarrollo frontend con AngularJS, implementando interfaces dinámicas y orientadas a experiencia de usuario.</w:t>
+        <w:t xml:space="preserve">Desarrollo frontend con </w:t>
+      </w:r>
+      <w:proofErr w:type="spellStart"/>
+      <w:r>
+        <w:rPr>
+          <w:rFonts w:ascii="Tahoma" w:eastAsia="Tahoma" w:hAnsi="Tahoma" w:cs="Tahoma"/>
+          <w:bCs/>
+          <w:iCs/>
+          <w:sz w:val="20"/>
+          <w:szCs w:val="20"/>
+        </w:rPr>
+        <w:t>AngularJS</w:t>
+      </w:r>
+      <w:proofErr w:type="spellEnd"/>
+      <w:r>
+        <w:rPr>
+          <w:rFonts w:ascii="Tahoma" w:eastAsia="Tahoma" w:hAnsi="Tahoma" w:cs="Tahoma"/>
+          <w:bCs/>
+          <w:iCs/>
+          <w:sz w:val="20"/>
+          <w:szCs w:val="20"/>
+        </w:rPr>
+        <w:t>, implementando interfaces dinámicas y orientadas a experiencia de usuario.</w:t>
       </w:r>
     </w:p>
     <w:p>
@@ -2798,7 +3556,29 @@
           <w:sz w:val="20"/>
           <w:szCs w:val="20"/>
         </w:rPr>
-        <w:t>Implementación de manejo centralizado de errores y notificaciones automáticas vía Telegram para monitoreo y respuesta temprana ante incidencias.</w:t>
+        <w:t xml:space="preserve">Implementación de manejo centralizado de errores y notificaciones automáticas vía </w:t>
+      </w:r>
+      <w:proofErr w:type="spellStart"/>
+      <w:r>
+        <w:rPr>
+          <w:rFonts w:ascii="Tahoma" w:eastAsia="Tahoma" w:hAnsi="Tahoma" w:cs="Tahoma"/>
+          <w:bCs/>
+          <w:iCs/>
+          <w:sz w:val="20"/>
+          <w:szCs w:val="20"/>
+        </w:rPr>
+        <w:t>Telegram</w:t>
+      </w:r>
+      <w:proofErr w:type="spellEnd"/>
+      <w:r>
+        <w:rPr>
+          <w:rFonts w:ascii="Tahoma" w:eastAsia="Tahoma" w:hAnsi="Tahoma" w:cs="Tahoma"/>
+          <w:bCs/>
+          <w:iCs/>
+          <w:sz w:val="20"/>
+          <w:szCs w:val="20"/>
+        </w:rPr>
+        <w:t xml:space="preserve"> para monitoreo y respuesta temprana ante incidencias.</w:t>
       </w:r>
     </w:p>
     <w:p>
@@ -2834,7 +3614,29 @@
           <w:sz w:val="20"/>
           <w:szCs w:val="20"/>
         </w:rPr>
-        <w:t>MDP Consulting, Lima, Perú</w:t>
+        <w:t xml:space="preserve">MDP </w:t>
+      </w:r>
+      <w:proofErr w:type="spellStart"/>
+      <w:r>
+        <w:rPr>
+          <w:rFonts w:ascii="Tahoma" w:eastAsia="Tahoma" w:hAnsi="Tahoma" w:cs="Tahoma"/>
+          <w:b/>
+          <w:iCs/>
+          <w:sz w:val="20"/>
+          <w:szCs w:val="20"/>
+        </w:rPr>
+        <w:t>Consulting</w:t>
+      </w:r>
+      <w:proofErr w:type="spellEnd"/>
+      <w:r>
+        <w:rPr>
+          <w:rFonts w:ascii="Tahoma" w:eastAsia="Tahoma" w:hAnsi="Tahoma" w:cs="Tahoma"/>
+          <w:b/>
+          <w:iCs/>
+          <w:sz w:val="20"/>
+          <w:szCs w:val="20"/>
+        </w:rPr>
+        <w:t>, Lima, Perú</w:t>
       </w:r>
     </w:p>
     <w:p>
@@ -2859,7 +3661,31 @@
           <w:sz w:val="20"/>
           <w:szCs w:val="20"/>
         </w:rPr>
-        <w:t>Training Bootcamp MDP</w:t>
+        <w:t xml:space="preserve">Training </w:t>
+      </w:r>
+      <w:proofErr w:type="spellStart"/>
+      <w:r>
+        <w:rPr>
+          <w:rFonts w:ascii="Tahoma" w:eastAsia="Tahoma" w:hAnsi="Tahoma" w:cs="Tahoma"/>
+          <w:b/>
+          <w:bCs/>
+          <w:iCs/>
+          <w:sz w:val="20"/>
+          <w:szCs w:val="20"/>
+        </w:rPr>
+        <w:t>Bootcamp</w:t>
+      </w:r>
+      <w:proofErr w:type="spellEnd"/>
+      <w:r>
+        <w:rPr>
+          <w:rFonts w:ascii="Tahoma" w:eastAsia="Tahoma" w:hAnsi="Tahoma" w:cs="Tahoma"/>
+          <w:b/>
+          <w:bCs/>
+          <w:iCs/>
+          <w:sz w:val="20"/>
+          <w:szCs w:val="20"/>
+        </w:rPr>
+        <w:t xml:space="preserve"> MDP</w:t>
       </w:r>
       <w:r>
         <w:rPr>
@@ -2946,7 +3772,29 @@
           <w:sz w:val="20"/>
           <w:szCs w:val="20"/>
         </w:rPr>
-        <w:t>Formación en backend con Java y frontend con Angular y React.</w:t>
+        <w:t xml:space="preserve">Formación en backend con Java y frontend con Angular y </w:t>
+      </w:r>
+      <w:proofErr w:type="spellStart"/>
+      <w:r>
+        <w:rPr>
+          <w:rFonts w:ascii="Tahoma" w:eastAsia="Tahoma" w:hAnsi="Tahoma" w:cs="Tahoma"/>
+          <w:bCs/>
+          <w:iCs/>
+          <w:sz w:val="20"/>
+          <w:szCs w:val="20"/>
+        </w:rPr>
+        <w:t>React</w:t>
+      </w:r>
+      <w:proofErr w:type="spellEnd"/>
+      <w:r>
+        <w:rPr>
+          <w:rFonts w:ascii="Tahoma" w:eastAsia="Tahoma" w:hAnsi="Tahoma" w:cs="Tahoma"/>
+          <w:bCs/>
+          <w:iCs/>
+          <w:sz w:val="20"/>
+          <w:szCs w:val="20"/>
+        </w:rPr>
+        <w:t>.</w:t>
       </w:r>
     </w:p>
     <w:p>
@@ -3067,16 +3915,53 @@
         </w:rPr>
         <w:t xml:space="preserve">Preprofesional </w:t>
       </w:r>
-      <w:r>
-        <w:rPr>
-          <w:rFonts w:ascii="Tahoma" w:eastAsia="Tahoma" w:hAnsi="Tahoma" w:cs="Tahoma"/>
-          <w:b/>
-          <w:bCs/>
-          <w:iCs/>
-          <w:sz w:val="20"/>
-          <w:szCs w:val="20"/>
-        </w:rPr>
-        <w:t>FullStack Developer PHP – Angular JS</w:t>
+      <w:proofErr w:type="spellStart"/>
+      <w:r>
+        <w:rPr>
+          <w:rFonts w:ascii="Tahoma" w:eastAsia="Tahoma" w:hAnsi="Tahoma" w:cs="Tahoma"/>
+          <w:b/>
+          <w:bCs/>
+          <w:iCs/>
+          <w:sz w:val="20"/>
+          <w:szCs w:val="20"/>
+        </w:rPr>
+        <w:t>FullStack</w:t>
+      </w:r>
+      <w:proofErr w:type="spellEnd"/>
+      <w:r>
+        <w:rPr>
+          <w:rFonts w:ascii="Tahoma" w:eastAsia="Tahoma" w:hAnsi="Tahoma" w:cs="Tahoma"/>
+          <w:b/>
+          <w:bCs/>
+          <w:iCs/>
+          <w:sz w:val="20"/>
+          <w:szCs w:val="20"/>
+        </w:rPr>
+        <w:t xml:space="preserve"> </w:t>
+      </w:r>
+      <w:proofErr w:type="spellStart"/>
+      <w:r>
+        <w:rPr>
+          <w:rFonts w:ascii="Tahoma" w:eastAsia="Tahoma" w:hAnsi="Tahoma" w:cs="Tahoma"/>
+          <w:b/>
+          <w:bCs/>
+          <w:iCs/>
+          <w:sz w:val="20"/>
+          <w:szCs w:val="20"/>
+        </w:rPr>
+        <w:t>Developer</w:t>
+      </w:r>
+      <w:proofErr w:type="spellEnd"/>
+      <w:r>
+        <w:rPr>
+          <w:rFonts w:ascii="Tahoma" w:eastAsia="Tahoma" w:hAnsi="Tahoma" w:cs="Tahoma"/>
+          <w:b/>
+          <w:bCs/>
+          <w:iCs/>
+          <w:sz w:val="20"/>
+          <w:szCs w:val="20"/>
+        </w:rPr>
+        <w:t xml:space="preserve"> PHP – Angular JS</w:t>
       </w:r>
       <w:r>
         <w:rPr>
@@ -3138,7 +4023,55 @@
           <w:szCs w:val="20"/>
           <w:lang w:val="en-US"/>
         </w:rPr>
-        <w:t>Desarrollo de funcionalidades backend y frontend utilizando Symfony (PHP).</w:t>
+        <w:t xml:space="preserve">Desarrollo de </w:t>
+      </w:r>
+      <w:proofErr w:type="spellStart"/>
+      <w:r>
+        <w:rPr>
+          <w:rFonts w:ascii="Tahoma" w:eastAsia="Tahoma" w:hAnsi="Tahoma" w:cs="Tahoma"/>
+          <w:bCs/>
+          <w:iCs/>
+          <w:sz w:val="20"/>
+          <w:szCs w:val="20"/>
+          <w:lang w:val="en-US"/>
+        </w:rPr>
+        <w:t>funcionalidades</w:t>
+      </w:r>
+      <w:proofErr w:type="spellEnd"/>
+      <w:r>
+        <w:rPr>
+          <w:rFonts w:ascii="Tahoma" w:eastAsia="Tahoma" w:hAnsi="Tahoma" w:cs="Tahoma"/>
+          <w:bCs/>
+          <w:iCs/>
+          <w:sz w:val="20"/>
+          <w:szCs w:val="20"/>
+          <w:lang w:val="en-US"/>
+        </w:rPr>
+        <w:t xml:space="preserve"> backend y frontend </w:t>
+      </w:r>
+      <w:proofErr w:type="spellStart"/>
+      <w:r>
+        <w:rPr>
+          <w:rFonts w:ascii="Tahoma" w:eastAsia="Tahoma" w:hAnsi="Tahoma" w:cs="Tahoma"/>
+          <w:bCs/>
+          <w:iCs/>
+          <w:sz w:val="20"/>
+          <w:szCs w:val="20"/>
+          <w:lang w:val="en-US"/>
+        </w:rPr>
+        <w:t>utilizando</w:t>
+      </w:r>
+      <w:proofErr w:type="spellEnd"/>
+      <w:r>
+        <w:rPr>
+          <w:rFonts w:ascii="Tahoma" w:eastAsia="Tahoma" w:hAnsi="Tahoma" w:cs="Tahoma"/>
+          <w:bCs/>
+          <w:iCs/>
+          <w:sz w:val="20"/>
+          <w:szCs w:val="20"/>
+          <w:lang w:val="en-US"/>
+        </w:rPr>
+        <w:t xml:space="preserve"> Symfony (PHP).</w:t>
       </w:r>
     </w:p>
     <w:p>
@@ -3162,16 +4095,173 @@
           <w:lang w:val="en-US"/>
         </w:rPr>
       </w:pPr>
-      <w:r>
-        <w:rPr>
-          <w:rFonts w:ascii="Tahoma" w:eastAsia="Tahoma" w:hAnsi="Tahoma" w:cs="Tahoma"/>
-          <w:bCs/>
-          <w:iCs/>
-          <w:sz w:val="20"/>
-          <w:szCs w:val="20"/>
-          <w:lang w:val="en-US"/>
-        </w:rPr>
-        <w:t>Participación en mantenimiento y mejora de módulos existentes del sistema.</w:t>
+      <w:proofErr w:type="spellStart"/>
+      <w:r>
+        <w:rPr>
+          <w:rFonts w:ascii="Tahoma" w:eastAsia="Tahoma" w:hAnsi="Tahoma" w:cs="Tahoma"/>
+          <w:bCs/>
+          <w:iCs/>
+          <w:sz w:val="20"/>
+          <w:szCs w:val="20"/>
+          <w:lang w:val="en-US"/>
+        </w:rPr>
+        <w:t>Participación</w:t>
+      </w:r>
+      <w:proofErr w:type="spellEnd"/>
+      <w:r>
+        <w:rPr>
+          <w:rFonts w:ascii="Tahoma" w:eastAsia="Tahoma" w:hAnsi="Tahoma" w:cs="Tahoma"/>
+          <w:bCs/>
+          <w:iCs/>
+          <w:sz w:val="20"/>
+          <w:szCs w:val="20"/>
+          <w:lang w:val="en-US"/>
+        </w:rPr>
+        <w:t xml:space="preserve"> </w:t>
+      </w:r>
+      <w:proofErr w:type="spellStart"/>
+      <w:r>
+        <w:rPr>
+          <w:rFonts w:ascii="Tahoma" w:eastAsia="Tahoma" w:hAnsi="Tahoma" w:cs="Tahoma"/>
+          <w:bCs/>
+          <w:iCs/>
+          <w:sz w:val="20"/>
+          <w:szCs w:val="20"/>
+          <w:lang w:val="en-US"/>
+        </w:rPr>
+        <w:t>en</w:t>
+      </w:r>
+      <w:proofErr w:type="spellEnd"/>
+      <w:r>
+        <w:rPr>
+          <w:rFonts w:ascii="Tahoma" w:eastAsia="Tahoma" w:hAnsi="Tahoma" w:cs="Tahoma"/>
+          <w:bCs/>
+          <w:iCs/>
+          <w:sz w:val="20"/>
+          <w:szCs w:val="20"/>
+          <w:lang w:val="en-US"/>
+        </w:rPr>
+        <w:t xml:space="preserve"> </w:t>
+      </w:r>
+      <w:proofErr w:type="spellStart"/>
+      <w:r>
+        <w:rPr>
+          <w:rFonts w:ascii="Tahoma" w:eastAsia="Tahoma" w:hAnsi="Tahoma" w:cs="Tahoma"/>
+          <w:bCs/>
+          <w:iCs/>
+          <w:sz w:val="20"/>
+          <w:szCs w:val="20"/>
+          <w:lang w:val="en-US"/>
+        </w:rPr>
+        <w:t>mantenimiento</w:t>
+      </w:r>
+      <w:proofErr w:type="spellEnd"/>
+      <w:r>
+        <w:rPr>
+          <w:rFonts w:ascii="Tahoma" w:eastAsia="Tahoma" w:hAnsi="Tahoma" w:cs="Tahoma"/>
+          <w:bCs/>
+          <w:iCs/>
+          <w:sz w:val="20"/>
+          <w:szCs w:val="20"/>
+          <w:lang w:val="en-US"/>
+        </w:rPr>
+        <w:t xml:space="preserve"> y </w:t>
+      </w:r>
+      <w:proofErr w:type="spellStart"/>
+      <w:r>
+        <w:rPr>
+          <w:rFonts w:ascii="Tahoma" w:eastAsia="Tahoma" w:hAnsi="Tahoma" w:cs="Tahoma"/>
+          <w:bCs/>
+          <w:iCs/>
+          <w:sz w:val="20"/>
+          <w:szCs w:val="20"/>
+          <w:lang w:val="en-US"/>
+        </w:rPr>
+        <w:t>mejora</w:t>
+      </w:r>
+      <w:proofErr w:type="spellEnd"/>
+      <w:r>
+        <w:rPr>
+          <w:rFonts w:ascii="Tahoma" w:eastAsia="Tahoma" w:hAnsi="Tahoma" w:cs="Tahoma"/>
+          <w:bCs/>
+          <w:iCs/>
+          <w:sz w:val="20"/>
+          <w:szCs w:val="20"/>
+          <w:lang w:val="en-US"/>
+        </w:rPr>
+        <w:t xml:space="preserve"> de </w:t>
+      </w:r>
+      <w:proofErr w:type="spellStart"/>
+      <w:r>
+        <w:rPr>
+          <w:rFonts w:ascii="Tahoma" w:eastAsia="Tahoma" w:hAnsi="Tahoma" w:cs="Tahoma"/>
+          <w:bCs/>
+          <w:iCs/>
+          <w:sz w:val="20"/>
+          <w:szCs w:val="20"/>
+          <w:lang w:val="en-US"/>
+        </w:rPr>
+        <w:t>módulos</w:t>
+      </w:r>
+      <w:proofErr w:type="spellEnd"/>
+      <w:r>
+        <w:rPr>
+          <w:rFonts w:ascii="Tahoma" w:eastAsia="Tahoma" w:hAnsi="Tahoma" w:cs="Tahoma"/>
+          <w:bCs/>
+          <w:iCs/>
+          <w:sz w:val="20"/>
+          <w:szCs w:val="20"/>
+          <w:lang w:val="en-US"/>
+        </w:rPr>
+        <w:t xml:space="preserve"> </w:t>
+      </w:r>
+      <w:proofErr w:type="spellStart"/>
+      <w:r>
+        <w:rPr>
+          <w:rFonts w:ascii="Tahoma" w:eastAsia="Tahoma" w:hAnsi="Tahoma" w:cs="Tahoma"/>
+          <w:bCs/>
+          <w:iCs/>
+          <w:sz w:val="20"/>
+          <w:szCs w:val="20"/>
+          <w:lang w:val="en-US"/>
+        </w:rPr>
+        <w:t>existentes</w:t>
+      </w:r>
+      <w:proofErr w:type="spellEnd"/>
+      <w:r>
+        <w:rPr>
+          <w:rFonts w:ascii="Tahoma" w:eastAsia="Tahoma" w:hAnsi="Tahoma" w:cs="Tahoma"/>
+          <w:bCs/>
+          <w:iCs/>
+          <w:sz w:val="20"/>
+          <w:szCs w:val="20"/>
+          <w:lang w:val="en-US"/>
+        </w:rPr>
+        <w:t xml:space="preserve"> del </w:t>
+      </w:r>
+      <w:proofErr w:type="spellStart"/>
+      <w:r>
+        <w:rPr>
+          <w:rFonts w:ascii="Tahoma" w:eastAsia="Tahoma" w:hAnsi="Tahoma" w:cs="Tahoma"/>
+          <w:bCs/>
+          <w:iCs/>
+          <w:sz w:val="20"/>
+          <w:szCs w:val="20"/>
+          <w:lang w:val="en-US"/>
+        </w:rPr>
+        <w:t>sistema</w:t>
+      </w:r>
+      <w:proofErr w:type="spellEnd"/>
+      <w:r>
+        <w:rPr>
+          <w:rFonts w:ascii="Tahoma" w:eastAsia="Tahoma" w:hAnsi="Tahoma" w:cs="Tahoma"/>
+          <w:bCs/>
+          <w:iCs/>
+          <w:sz w:val="20"/>
+          <w:szCs w:val="20"/>
+          <w:lang w:val="en-US"/>
+        </w:rPr>
+        <w:t>.</w:t>
       </w:r>
     </w:p>
     <w:p>
@@ -3195,16 +4285,101 @@
           <w:lang w:val="en-US"/>
         </w:rPr>
       </w:pPr>
-      <w:r>
-        <w:rPr>
-          <w:rFonts w:ascii="Tahoma" w:eastAsia="Tahoma" w:hAnsi="Tahoma" w:cs="Tahoma"/>
-          <w:bCs/>
-          <w:iCs/>
-          <w:sz w:val="20"/>
-          <w:szCs w:val="20"/>
-          <w:lang w:val="en-US"/>
-        </w:rPr>
-        <w:t>Implementación de consultas y estructuras en MySQL.</w:t>
+      <w:proofErr w:type="spellStart"/>
+      <w:r>
+        <w:rPr>
+          <w:rFonts w:ascii="Tahoma" w:eastAsia="Tahoma" w:hAnsi="Tahoma" w:cs="Tahoma"/>
+          <w:bCs/>
+          <w:iCs/>
+          <w:sz w:val="20"/>
+          <w:szCs w:val="20"/>
+          <w:lang w:val="en-US"/>
+        </w:rPr>
+        <w:t>Implementación</w:t>
+      </w:r>
+      <w:proofErr w:type="spellEnd"/>
+      <w:r>
+        <w:rPr>
+          <w:rFonts w:ascii="Tahoma" w:eastAsia="Tahoma" w:hAnsi="Tahoma" w:cs="Tahoma"/>
+          <w:bCs/>
+          <w:iCs/>
+          <w:sz w:val="20"/>
+          <w:szCs w:val="20"/>
+          <w:lang w:val="en-US"/>
+        </w:rPr>
+        <w:t xml:space="preserve"> de </w:t>
+      </w:r>
+      <w:proofErr w:type="spellStart"/>
+      <w:r>
+        <w:rPr>
+          <w:rFonts w:ascii="Tahoma" w:eastAsia="Tahoma" w:hAnsi="Tahoma" w:cs="Tahoma"/>
+          <w:bCs/>
+          <w:iCs/>
+          <w:sz w:val="20"/>
+          <w:szCs w:val="20"/>
+          <w:lang w:val="en-US"/>
+        </w:rPr>
+        <w:t>consultas</w:t>
+      </w:r>
+      <w:proofErr w:type="spellEnd"/>
+      <w:r>
+        <w:rPr>
+          <w:rFonts w:ascii="Tahoma" w:eastAsia="Tahoma" w:hAnsi="Tahoma" w:cs="Tahoma"/>
+          <w:bCs/>
+          <w:iCs/>
+          <w:sz w:val="20"/>
+          <w:szCs w:val="20"/>
+          <w:lang w:val="en-US"/>
+        </w:rPr>
+        <w:t xml:space="preserve"> y </w:t>
+      </w:r>
+      <w:proofErr w:type="spellStart"/>
+      <w:r>
+        <w:rPr>
+          <w:rFonts w:ascii="Tahoma" w:eastAsia="Tahoma" w:hAnsi="Tahoma" w:cs="Tahoma"/>
+          <w:bCs/>
+          <w:iCs/>
+          <w:sz w:val="20"/>
+          <w:szCs w:val="20"/>
+          <w:lang w:val="en-US"/>
+        </w:rPr>
+        <w:t>estructuras</w:t>
+      </w:r>
+      <w:proofErr w:type="spellEnd"/>
+      <w:r>
+        <w:rPr>
+          <w:rFonts w:ascii="Tahoma" w:eastAsia="Tahoma" w:hAnsi="Tahoma" w:cs="Tahoma"/>
+          <w:bCs/>
+          <w:iCs/>
+          <w:sz w:val="20"/>
+          <w:szCs w:val="20"/>
+          <w:lang w:val="en-US"/>
+        </w:rPr>
+        <w:t xml:space="preserve"> </w:t>
+      </w:r>
+      <w:proofErr w:type="spellStart"/>
+      <w:r>
+        <w:rPr>
+          <w:rFonts w:ascii="Tahoma" w:eastAsia="Tahoma" w:hAnsi="Tahoma" w:cs="Tahoma"/>
+          <w:bCs/>
+          <w:iCs/>
+          <w:sz w:val="20"/>
+          <w:szCs w:val="20"/>
+          <w:lang w:val="en-US"/>
+        </w:rPr>
+        <w:t>en</w:t>
+      </w:r>
+      <w:proofErr w:type="spellEnd"/>
+      <w:r>
+        <w:rPr>
+          <w:rFonts w:ascii="Tahoma" w:eastAsia="Tahoma" w:hAnsi="Tahoma" w:cs="Tahoma"/>
+          <w:bCs/>
+          <w:iCs/>
+          <w:sz w:val="20"/>
+          <w:szCs w:val="20"/>
+          <w:lang w:val="en-US"/>
+        </w:rPr>
+        <w:t xml:space="preserve"> MySQL.</w:t>
       </w:r>
     </w:p>
     <w:p>
@@ -3228,16 +4403,173 @@
           <w:lang w:val="en-US"/>
         </w:rPr>
       </w:pPr>
-      <w:r>
-        <w:rPr>
-          <w:rFonts w:ascii="Tahoma" w:eastAsia="Tahoma" w:hAnsi="Tahoma" w:cs="Tahoma"/>
-          <w:bCs/>
-          <w:iCs/>
-          <w:sz w:val="20"/>
-          <w:szCs w:val="20"/>
-          <w:lang w:val="en-US"/>
-        </w:rPr>
-        <w:t>Soporte en pruebas, validación de funcionalidades y corrección de incidencias.</w:t>
+      <w:proofErr w:type="spellStart"/>
+      <w:r>
+        <w:rPr>
+          <w:rFonts w:ascii="Tahoma" w:eastAsia="Tahoma" w:hAnsi="Tahoma" w:cs="Tahoma"/>
+          <w:bCs/>
+          <w:iCs/>
+          <w:sz w:val="20"/>
+          <w:szCs w:val="20"/>
+          <w:lang w:val="en-US"/>
+        </w:rPr>
+        <w:t>Soporte</w:t>
+      </w:r>
+      <w:proofErr w:type="spellEnd"/>
+      <w:r>
+        <w:rPr>
+          <w:rFonts w:ascii="Tahoma" w:eastAsia="Tahoma" w:hAnsi="Tahoma" w:cs="Tahoma"/>
+          <w:bCs/>
+          <w:iCs/>
+          <w:sz w:val="20"/>
+          <w:szCs w:val="20"/>
+          <w:lang w:val="en-US"/>
+        </w:rPr>
+        <w:t xml:space="preserve"> </w:t>
+      </w:r>
+      <w:proofErr w:type="spellStart"/>
+      <w:r>
+        <w:rPr>
+          <w:rFonts w:ascii="Tahoma" w:eastAsia="Tahoma" w:hAnsi="Tahoma" w:cs="Tahoma"/>
+          <w:bCs/>
+          <w:iCs/>
+          <w:sz w:val="20"/>
+          <w:szCs w:val="20"/>
+          <w:lang w:val="en-US"/>
+        </w:rPr>
+        <w:t>en</w:t>
+      </w:r>
+      <w:proofErr w:type="spellEnd"/>
+      <w:r>
+        <w:rPr>
+          <w:rFonts w:ascii="Tahoma" w:eastAsia="Tahoma" w:hAnsi="Tahoma" w:cs="Tahoma"/>
+          <w:bCs/>
+          <w:iCs/>
+          <w:sz w:val="20"/>
+          <w:szCs w:val="20"/>
+          <w:lang w:val="en-US"/>
+        </w:rPr>
+        <w:t xml:space="preserve"> </w:t>
+      </w:r>
+      <w:proofErr w:type="spellStart"/>
+      <w:r>
+        <w:rPr>
+          <w:rFonts w:ascii="Tahoma" w:eastAsia="Tahoma" w:hAnsi="Tahoma" w:cs="Tahoma"/>
+          <w:bCs/>
+          <w:iCs/>
+          <w:sz w:val="20"/>
+          <w:szCs w:val="20"/>
+          <w:lang w:val="en-US"/>
+        </w:rPr>
+        <w:t>pruebas</w:t>
+      </w:r>
+      <w:proofErr w:type="spellEnd"/>
+      <w:r>
+        <w:rPr>
+          <w:rFonts w:ascii="Tahoma" w:eastAsia="Tahoma" w:hAnsi="Tahoma" w:cs="Tahoma"/>
+          <w:bCs/>
+          <w:iCs/>
+          <w:sz w:val="20"/>
+          <w:szCs w:val="20"/>
+          <w:lang w:val="en-US"/>
+        </w:rPr>
+        <w:t xml:space="preserve">, </w:t>
+      </w:r>
+      <w:proofErr w:type="spellStart"/>
+      <w:r>
+        <w:rPr>
+          <w:rFonts w:ascii="Tahoma" w:eastAsia="Tahoma" w:hAnsi="Tahoma" w:cs="Tahoma"/>
+          <w:bCs/>
+          <w:iCs/>
+          <w:sz w:val="20"/>
+          <w:szCs w:val="20"/>
+          <w:lang w:val="en-US"/>
+        </w:rPr>
+        <w:t>validación</w:t>
+      </w:r>
+      <w:proofErr w:type="spellEnd"/>
+      <w:r>
+        <w:rPr>
+          <w:rFonts w:ascii="Tahoma" w:eastAsia="Tahoma" w:hAnsi="Tahoma" w:cs="Tahoma"/>
+          <w:bCs/>
+          <w:iCs/>
+          <w:sz w:val="20"/>
+          <w:szCs w:val="20"/>
+          <w:lang w:val="en-US"/>
+        </w:rPr>
+        <w:t xml:space="preserve"> de </w:t>
+      </w:r>
+      <w:proofErr w:type="spellStart"/>
+      <w:r>
+        <w:rPr>
+          <w:rFonts w:ascii="Tahoma" w:eastAsia="Tahoma" w:hAnsi="Tahoma" w:cs="Tahoma"/>
+          <w:bCs/>
+          <w:iCs/>
+          <w:sz w:val="20"/>
+          <w:szCs w:val="20"/>
+          <w:lang w:val="en-US"/>
+        </w:rPr>
+        <w:t>funcionalidades</w:t>
+      </w:r>
+      <w:proofErr w:type="spellEnd"/>
+      <w:r>
+        <w:rPr>
+          <w:rFonts w:ascii="Tahoma" w:eastAsia="Tahoma" w:hAnsi="Tahoma" w:cs="Tahoma"/>
+          <w:bCs/>
+          <w:iCs/>
+          <w:sz w:val="20"/>
+          <w:szCs w:val="20"/>
+          <w:lang w:val="en-US"/>
+        </w:rPr>
+        <w:t xml:space="preserve"> y </w:t>
+      </w:r>
+      <w:proofErr w:type="spellStart"/>
+      <w:r>
+        <w:rPr>
+          <w:rFonts w:ascii="Tahoma" w:eastAsia="Tahoma" w:hAnsi="Tahoma" w:cs="Tahoma"/>
+          <w:bCs/>
+          <w:iCs/>
+          <w:sz w:val="20"/>
+          <w:szCs w:val="20"/>
+          <w:lang w:val="en-US"/>
+        </w:rPr>
+        <w:t>corrección</w:t>
+      </w:r>
+      <w:proofErr w:type="spellEnd"/>
+      <w:r>
+        <w:rPr>
+          <w:rFonts w:ascii="Tahoma" w:eastAsia="Tahoma" w:hAnsi="Tahoma" w:cs="Tahoma"/>
+          <w:bCs/>
+          <w:iCs/>
+          <w:sz w:val="20"/>
+          <w:szCs w:val="20"/>
+          <w:lang w:val="en-US"/>
+        </w:rPr>
+        <w:t xml:space="preserve"> de </w:t>
+      </w:r>
+      <w:proofErr w:type="spellStart"/>
+      <w:r>
+        <w:rPr>
+          <w:rFonts w:ascii="Tahoma" w:eastAsia="Tahoma" w:hAnsi="Tahoma" w:cs="Tahoma"/>
+          <w:bCs/>
+          <w:iCs/>
+          <w:sz w:val="20"/>
+          <w:szCs w:val="20"/>
+          <w:lang w:val="en-US"/>
+        </w:rPr>
+        <w:t>incidencias</w:t>
+      </w:r>
+      <w:proofErr w:type="spellEnd"/>
+      <w:r>
+        <w:rPr>
+          <w:rFonts w:ascii="Tahoma" w:eastAsia="Tahoma" w:hAnsi="Tahoma" w:cs="Tahoma"/>
+          <w:bCs/>
+          <w:iCs/>
+          <w:sz w:val="20"/>
+          <w:szCs w:val="20"/>
+          <w:lang w:val="en-US"/>
+        </w:rPr>
+        <w:t>.</w:t>
       </w:r>
     </w:p>
     <w:p>
@@ -3474,6 +4806,7 @@
         </w:rPr>
         <w:br/>
       </w:r>
+      <w:proofErr w:type="spellStart"/>
       <w:r>
         <w:rPr>
           <w:rFonts w:ascii="Tahoma" w:eastAsia="Tahoma" w:hAnsi="Tahoma"/>
@@ -3481,15 +4814,36 @@
           <w:i/>
           <w:lang w:val="en-US"/>
         </w:rPr>
-        <w:t>Cursos y certificaciones</w:t>
-      </w:r>
-    </w:p>
-    <w:p>
-      <w:pPr>
+        <w:t>Cursos</w:t>
+      </w:r>
+      <w:proofErr w:type="spellEnd"/>
+      <w:r>
         <w:rPr>
           <w:rFonts w:ascii="Tahoma" w:eastAsia="Tahoma" w:hAnsi="Tahoma"/>
           <w:b/>
           <w:i/>
+          <w:lang w:val="en-US"/>
+        </w:rPr>
+        <w:t xml:space="preserve"> y </w:t>
+      </w:r>
+      <w:proofErr w:type="spellStart"/>
+      <w:r>
+        <w:rPr>
+          <w:rFonts w:ascii="Tahoma" w:eastAsia="Tahoma" w:hAnsi="Tahoma"/>
+          <w:b/>
+          <w:i/>
+          <w:lang w:val="en-US"/>
+        </w:rPr>
+        <w:t>certificaciones</w:t>
+      </w:r>
+      <w:proofErr w:type="spellEnd"/>
+    </w:p>
+    <w:p>
+      <w:pPr>
+        <w:rPr>
+          <w:rFonts w:ascii="Tahoma" w:eastAsia="Tahoma" w:hAnsi="Tahoma"/>
+          <w:b/>
+          <w:i/>
           <w:sz w:val="20"/>
           <w:szCs w:val="20"/>
           <w:lang w:val="en-US"/>
@@ -3541,18 +4895,514 @@
       </w:pPr>
       <w:r>
         <w:rPr>
-          <w:rFonts w:ascii="Tahoma" w:eastAsia="Tahoma" w:hAnsi="Tahoma"/>
-          <w:bCs/>
-          <w:sz w:val="20"/>
-          <w:szCs w:val="20"/>
-          <w:lang w:val="en-US"/>
-        </w:rPr>
-        <w:t>Seguridad de la información</w:t>
-      </w:r>
-      <w:r>
-        <w:rPr>
-          <w:rFonts w:ascii="Tahoma" w:eastAsia="Tahoma" w:hAnsi="Tahoma"/>
-          <w:bCs/>
+          <w:rFonts w:ascii="Tahoma" w:eastAsia="Tahoma" w:hAnsi="Tahoma" w:cs="Tahoma"/>
+          <w:sz w:val="20"/>
+          <w:szCs w:val="20"/>
+          <w:lang w:val="en-US"/>
+        </w:rPr>
+        <w:t>Build Generative AI Agents with Vertex AI and Flutter – Google Cloud / Coursera</w:t>
+      </w:r>
+    </w:p>
+    <w:p>
+      <w:pPr>
+        <w:pStyle w:val="Prrafodelista"/>
+        <w:numPr>
+          <w:ilvl w:val="0"/>
+          <w:numId w:val="9"/>
+        </w:numPr>
+        <w:rPr>
+          <w:rFonts w:ascii="Tahoma" w:eastAsia="Tahoma" w:hAnsi="Tahoma" w:cs="Tahoma"/>
+          <w:sz w:val="20"/>
+          <w:szCs w:val="20"/>
+          <w:lang w:val="en-US"/>
+        </w:rPr>
+      </w:pPr>
+      <w:r>
+        <w:rPr>
+          <w:rFonts w:ascii="Tahoma" w:eastAsia="Tahoma" w:hAnsi="Tahoma" w:cs="Tahoma"/>
+          <w:sz w:val="20"/>
+          <w:szCs w:val="20"/>
+          <w:lang w:val="en-US"/>
+        </w:rPr>
+        <w:t>Generative AI: Elevate your Software Development Career – IBM / Coursera</w:t>
+      </w:r>
+    </w:p>
+    <w:p>
+      <w:pPr>
+        <w:pStyle w:val="Prrafodelista"/>
+        <w:numPr>
+          <w:ilvl w:val="0"/>
+          <w:numId w:val="9"/>
+        </w:numPr>
+        <w:rPr>
+          <w:rFonts w:ascii="Tahoma" w:eastAsia="Tahoma" w:hAnsi="Tahoma" w:cs="Tahoma"/>
+          <w:sz w:val="20"/>
+          <w:szCs w:val="20"/>
+          <w:lang w:val="en-US"/>
+        </w:rPr>
+      </w:pPr>
+      <w:r>
+        <w:rPr>
+          <w:rFonts w:ascii="Tahoma" w:eastAsia="Tahoma" w:hAnsi="Tahoma" w:cs="Tahoma"/>
+          <w:sz w:val="20"/>
+          <w:szCs w:val="20"/>
+          <w:lang w:val="en-US"/>
+        </w:rPr>
+        <w:t>Gen AI Agents: Transform Your Organization – Google Cloud / Coursera</w:t>
+      </w:r>
+    </w:p>
+    <w:p>
+      <w:pPr>
+        <w:pStyle w:val="Prrafodelista"/>
+        <w:numPr>
+          <w:ilvl w:val="0"/>
+          <w:numId w:val="9"/>
+        </w:numPr>
+        <w:rPr>
+          <w:rFonts w:ascii="Tahoma" w:eastAsia="Tahoma" w:hAnsi="Tahoma" w:cs="Tahoma"/>
+          <w:sz w:val="20"/>
+          <w:szCs w:val="20"/>
+          <w:lang w:val="en-US"/>
+        </w:rPr>
+      </w:pPr>
+      <w:r>
+        <w:rPr>
+          <w:rFonts w:ascii="Tahoma" w:eastAsia="Tahoma" w:hAnsi="Tahoma" w:cs="Tahoma"/>
+          <w:sz w:val="20"/>
+          <w:szCs w:val="20"/>
+          <w:lang w:val="en-US"/>
+        </w:rPr>
+        <w:t>Generative AI: Introduction and Applications – IBM / Coursera</w:t>
+      </w:r>
+    </w:p>
+    <w:p>
+      <w:pPr>
+        <w:pStyle w:val="Prrafodelista"/>
+        <w:numPr>
+          <w:ilvl w:val="0"/>
+          <w:numId w:val="9"/>
+        </w:numPr>
+        <w:rPr>
+          <w:rFonts w:ascii="Tahoma" w:eastAsia="Tahoma" w:hAnsi="Tahoma" w:cs="Tahoma"/>
+          <w:sz w:val="20"/>
+          <w:szCs w:val="20"/>
+          <w:lang w:val="en-US"/>
+        </w:rPr>
+      </w:pPr>
+      <w:r>
+        <w:rPr>
+          <w:rFonts w:ascii="Tahoma" w:eastAsia="Tahoma" w:hAnsi="Tahoma" w:cs="Tahoma"/>
+          <w:sz w:val="20"/>
+          <w:szCs w:val="20"/>
+          <w:lang w:val="en-US"/>
+        </w:rPr>
+        <w:t>AI-Powered Software and System Design – DeepLearning.AI / Coursera</w:t>
+      </w:r>
+    </w:p>
+    <w:p>
+      <w:pPr>
+        <w:pStyle w:val="Prrafodelista"/>
+        <w:numPr>
+          <w:ilvl w:val="0"/>
+          <w:numId w:val="9"/>
+        </w:numPr>
+        <w:rPr>
+          <w:rFonts w:ascii="Tahoma" w:eastAsia="Tahoma" w:hAnsi="Tahoma" w:cs="Tahoma"/>
+          <w:sz w:val="20"/>
+          <w:szCs w:val="20"/>
+          <w:lang w:val="en-US"/>
+        </w:rPr>
+      </w:pPr>
+      <w:r>
+        <w:rPr>
+          <w:rFonts w:ascii="Tahoma" w:eastAsia="Tahoma" w:hAnsi="Tahoma" w:cs="Tahoma"/>
+          <w:sz w:val="20"/>
+          <w:szCs w:val="20"/>
+          <w:lang w:val="en-US"/>
+        </w:rPr>
+        <w:t xml:space="preserve">Agentic AI with </w:t>
+      </w:r>
+      <w:proofErr w:type="spellStart"/>
+      <w:r>
+        <w:rPr>
+          <w:rFonts w:ascii="Tahoma" w:eastAsia="Tahoma" w:hAnsi="Tahoma" w:cs="Tahoma"/>
+          <w:sz w:val="20"/>
+          <w:szCs w:val="20"/>
+          <w:lang w:val="en-US"/>
+        </w:rPr>
+        <w:t>LangGraph</w:t>
+      </w:r>
+      <w:proofErr w:type="spellEnd"/>
+      <w:r>
+        <w:rPr>
+          <w:rFonts w:ascii="Tahoma" w:eastAsia="Tahoma" w:hAnsi="Tahoma" w:cs="Tahoma"/>
+          <w:sz w:val="20"/>
+          <w:szCs w:val="20"/>
+          <w:lang w:val="en-US"/>
+        </w:rPr>
+        <w:t xml:space="preserve">, </w:t>
+      </w:r>
+      <w:proofErr w:type="spellStart"/>
+      <w:r>
+        <w:rPr>
+          <w:rFonts w:ascii="Tahoma" w:eastAsia="Tahoma" w:hAnsi="Tahoma" w:cs="Tahoma"/>
+          <w:sz w:val="20"/>
+          <w:szCs w:val="20"/>
+          <w:lang w:val="en-US"/>
+        </w:rPr>
+        <w:t>CrewAI</w:t>
+      </w:r>
+      <w:proofErr w:type="spellEnd"/>
+      <w:r>
+        <w:rPr>
+          <w:rFonts w:ascii="Tahoma" w:eastAsia="Tahoma" w:hAnsi="Tahoma" w:cs="Tahoma"/>
+          <w:sz w:val="20"/>
+          <w:szCs w:val="20"/>
+          <w:lang w:val="en-US"/>
+        </w:rPr>
+        <w:t xml:space="preserve">, </w:t>
+      </w:r>
+      <w:proofErr w:type="spellStart"/>
+      <w:r>
+        <w:rPr>
+          <w:rFonts w:ascii="Tahoma" w:eastAsia="Tahoma" w:hAnsi="Tahoma" w:cs="Tahoma"/>
+          <w:sz w:val="20"/>
+          <w:szCs w:val="20"/>
+          <w:lang w:val="en-US"/>
+        </w:rPr>
+        <w:t>AutoGen</w:t>
+      </w:r>
+      <w:proofErr w:type="spellEnd"/>
+      <w:r>
+        <w:rPr>
+          <w:rFonts w:ascii="Tahoma" w:eastAsia="Tahoma" w:hAnsi="Tahoma" w:cs="Tahoma"/>
+          <w:sz w:val="20"/>
+          <w:szCs w:val="20"/>
+          <w:lang w:val="en-US"/>
+        </w:rPr>
+        <w:t xml:space="preserve"> and </w:t>
+      </w:r>
+      <w:proofErr w:type="spellStart"/>
+      <w:r>
+        <w:rPr>
+          <w:rFonts w:ascii="Tahoma" w:eastAsia="Tahoma" w:hAnsi="Tahoma" w:cs="Tahoma"/>
+          <w:sz w:val="20"/>
+          <w:szCs w:val="20"/>
+          <w:lang w:val="en-US"/>
+        </w:rPr>
+        <w:t>BeeAI</w:t>
+      </w:r>
+      <w:proofErr w:type="spellEnd"/>
+      <w:r>
+        <w:rPr>
+          <w:rFonts w:ascii="Tahoma" w:eastAsia="Tahoma" w:hAnsi="Tahoma" w:cs="Tahoma"/>
+          <w:sz w:val="20"/>
+          <w:szCs w:val="20"/>
+          <w:lang w:val="en-US"/>
+        </w:rPr>
+        <w:t xml:space="preserve"> – IBM / Coursera</w:t>
+      </w:r>
+    </w:p>
+    <w:p>
+      <w:pPr>
+        <w:pStyle w:val="Prrafodelista"/>
+        <w:numPr>
+          <w:ilvl w:val="0"/>
+          <w:numId w:val="9"/>
+        </w:numPr>
+        <w:rPr>
+          <w:rFonts w:ascii="Tahoma" w:eastAsia="Tahoma" w:hAnsi="Tahoma" w:cs="Tahoma"/>
+          <w:sz w:val="20"/>
+          <w:szCs w:val="20"/>
+          <w:lang w:val="en-US"/>
+        </w:rPr>
+      </w:pPr>
+      <w:r>
+        <w:rPr>
+          <w:rFonts w:ascii="Tahoma" w:eastAsia="Tahoma" w:hAnsi="Tahoma" w:cs="Tahoma"/>
+          <w:sz w:val="20"/>
+          <w:szCs w:val="20"/>
+          <w:lang w:val="en-US"/>
+        </w:rPr>
+        <w:t>Team Software Engineering with AI – DeepLearning.AI / Coursera</w:t>
+      </w:r>
+    </w:p>
+    <w:p>
+      <w:pPr>
+        <w:pStyle w:val="Prrafodelista"/>
+        <w:numPr>
+          <w:ilvl w:val="0"/>
+          <w:numId w:val="9"/>
+        </w:numPr>
+        <w:rPr>
+          <w:rFonts w:ascii="Tahoma" w:eastAsia="Tahoma" w:hAnsi="Tahoma" w:cs="Tahoma"/>
+          <w:sz w:val="20"/>
+          <w:szCs w:val="20"/>
+          <w:lang w:val="en-US"/>
+        </w:rPr>
+      </w:pPr>
+      <w:r>
+        <w:rPr>
+          <w:rFonts w:ascii="Tahoma" w:eastAsia="Tahoma" w:hAnsi="Tahoma" w:cs="Tahoma"/>
+          <w:sz w:val="20"/>
+          <w:szCs w:val="20"/>
+          <w:lang w:val="en-US"/>
+        </w:rPr>
+        <w:t xml:space="preserve">Agentic AI with </w:t>
+      </w:r>
+      <w:proofErr w:type="spellStart"/>
+      <w:r>
+        <w:rPr>
+          <w:rFonts w:ascii="Tahoma" w:eastAsia="Tahoma" w:hAnsi="Tahoma" w:cs="Tahoma"/>
+          <w:sz w:val="20"/>
+          <w:szCs w:val="20"/>
+          <w:lang w:val="en-US"/>
+        </w:rPr>
+        <w:t>LangChain</w:t>
+      </w:r>
+      <w:proofErr w:type="spellEnd"/>
+      <w:r>
+        <w:rPr>
+          <w:rFonts w:ascii="Tahoma" w:eastAsia="Tahoma" w:hAnsi="Tahoma" w:cs="Tahoma"/>
+          <w:sz w:val="20"/>
+          <w:szCs w:val="20"/>
+          <w:lang w:val="en-US"/>
+        </w:rPr>
+        <w:t xml:space="preserve"> and </w:t>
+      </w:r>
+      <w:proofErr w:type="spellStart"/>
+      <w:r>
+        <w:rPr>
+          <w:rFonts w:ascii="Tahoma" w:eastAsia="Tahoma" w:hAnsi="Tahoma" w:cs="Tahoma"/>
+          <w:sz w:val="20"/>
+          <w:szCs w:val="20"/>
+          <w:lang w:val="en-US"/>
+        </w:rPr>
+        <w:t>LangGraph</w:t>
+      </w:r>
+      <w:proofErr w:type="spellEnd"/>
+      <w:r>
+        <w:rPr>
+          <w:rFonts w:ascii="Tahoma" w:eastAsia="Tahoma" w:hAnsi="Tahoma" w:cs="Tahoma"/>
+          <w:sz w:val="20"/>
+          <w:szCs w:val="20"/>
+          <w:lang w:val="en-US"/>
+        </w:rPr>
+        <w:t xml:space="preserve"> – IBM / Coursera</w:t>
+      </w:r>
+    </w:p>
+    <w:p>
+      <w:pPr>
+        <w:pStyle w:val="Prrafodelista"/>
+        <w:numPr>
+          <w:ilvl w:val="0"/>
+          <w:numId w:val="9"/>
+        </w:numPr>
+        <w:rPr>
+          <w:rFonts w:ascii="Tahoma" w:eastAsia="Tahoma" w:hAnsi="Tahoma" w:cs="Tahoma"/>
+          <w:sz w:val="20"/>
+          <w:szCs w:val="20"/>
+          <w:lang w:val="en-US"/>
+        </w:rPr>
+      </w:pPr>
+      <w:r>
+        <w:rPr>
+          <w:rFonts w:ascii="Tahoma" w:eastAsia="Tahoma" w:hAnsi="Tahoma" w:cs="Tahoma"/>
+          <w:sz w:val="20"/>
+          <w:szCs w:val="20"/>
+          <w:lang w:val="en-US"/>
+        </w:rPr>
+        <w:t>Introduction to Generative AI for Software Development – DeepLearning.AI / Coursera</w:t>
+      </w:r>
+    </w:p>
+    <w:p>
+      <w:pPr>
+        <w:pStyle w:val="Prrafodelista"/>
+        <w:numPr>
+          <w:ilvl w:val="0"/>
+          <w:numId w:val="9"/>
+        </w:numPr>
+        <w:rPr>
+          <w:rFonts w:ascii="Tahoma" w:eastAsia="Tahoma" w:hAnsi="Tahoma" w:cs="Tahoma"/>
+          <w:sz w:val="20"/>
+          <w:szCs w:val="20"/>
+          <w:lang w:val="en-US"/>
+        </w:rPr>
+      </w:pPr>
+      <w:r>
+        <w:rPr>
+          <w:rFonts w:ascii="Tahoma" w:eastAsia="Tahoma" w:hAnsi="Tahoma" w:cs="Tahoma"/>
+          <w:sz w:val="20"/>
+          <w:szCs w:val="20"/>
+          <w:lang w:val="en-US"/>
+        </w:rPr>
+        <w:t xml:space="preserve">Fundamentals of AI Agents Using RAG and </w:t>
+      </w:r>
+      <w:proofErr w:type="spellStart"/>
+      <w:r>
+        <w:rPr>
+          <w:rFonts w:ascii="Tahoma" w:eastAsia="Tahoma" w:hAnsi="Tahoma" w:cs="Tahoma"/>
+          <w:sz w:val="20"/>
+          <w:szCs w:val="20"/>
+          <w:lang w:val="en-US"/>
+        </w:rPr>
+        <w:t>LangChain</w:t>
+      </w:r>
+      <w:proofErr w:type="spellEnd"/>
+      <w:r>
+        <w:rPr>
+          <w:rFonts w:ascii="Tahoma" w:eastAsia="Tahoma" w:hAnsi="Tahoma" w:cs="Tahoma"/>
+          <w:sz w:val="20"/>
+          <w:szCs w:val="20"/>
+          <w:lang w:val="en-US"/>
+        </w:rPr>
+        <w:t xml:space="preserve"> – IBM / Coursera</w:t>
+      </w:r>
+    </w:p>
+    <w:p>
+      <w:pPr>
+        <w:pStyle w:val="Prrafodelista"/>
+        <w:numPr>
+          <w:ilvl w:val="0"/>
+          <w:numId w:val="9"/>
+        </w:numPr>
+        <w:rPr>
+          <w:rFonts w:ascii="Tahoma" w:eastAsia="Tahoma" w:hAnsi="Tahoma" w:cs="Tahoma"/>
+          <w:sz w:val="20"/>
+          <w:szCs w:val="20"/>
+          <w:lang w:val="en-US"/>
+        </w:rPr>
+      </w:pPr>
+      <w:r>
+        <w:rPr>
+          <w:rFonts w:ascii="Tahoma" w:eastAsia="Tahoma" w:hAnsi="Tahoma" w:cs="Tahoma"/>
+          <w:sz w:val="20"/>
+          <w:szCs w:val="20"/>
+          <w:lang w:val="en-US"/>
+        </w:rPr>
+        <w:t>Advanced Prompt Engineering for Everyone – Vanderbilt University / Coursera</w:t>
+      </w:r>
+    </w:p>
+    <w:p>
+      <w:pPr>
+        <w:pStyle w:val="Prrafodelista"/>
+        <w:numPr>
+          <w:ilvl w:val="0"/>
+          <w:numId w:val="9"/>
+        </w:numPr>
+        <w:rPr>
+          <w:rFonts w:ascii="Tahoma" w:eastAsia="Tahoma" w:hAnsi="Tahoma" w:cs="Tahoma"/>
+          <w:sz w:val="20"/>
+          <w:szCs w:val="20"/>
+          <w:lang w:val="en-US"/>
+        </w:rPr>
+      </w:pPr>
+      <w:r>
+        <w:rPr>
+          <w:rFonts w:ascii="Tahoma" w:eastAsia="Tahoma" w:hAnsi="Tahoma" w:cs="Tahoma"/>
+          <w:sz w:val="20"/>
+          <w:szCs w:val="20"/>
+          <w:lang w:val="en-US"/>
+        </w:rPr>
+        <w:t>Generative AI for Everyone – DeepLearning.AI / Coursera</w:t>
+      </w:r>
+    </w:p>
+    <w:p>
+      <w:pPr>
+        <w:pStyle w:val="Prrafodelista"/>
+        <w:numPr>
+          <w:ilvl w:val="0"/>
+          <w:numId w:val="9"/>
+        </w:numPr>
+        <w:rPr>
+          <w:rFonts w:ascii="Tahoma" w:eastAsia="Tahoma" w:hAnsi="Tahoma" w:cs="Tahoma"/>
+          <w:sz w:val="20"/>
+          <w:szCs w:val="20"/>
+          <w:lang w:val="en-US"/>
+        </w:rPr>
+      </w:pPr>
+      <w:r>
+        <w:rPr>
+          <w:rFonts w:ascii="Tahoma" w:eastAsia="Tahoma" w:hAnsi="Tahoma" w:cs="Tahoma"/>
+          <w:sz w:val="20"/>
+          <w:szCs w:val="20"/>
+          <w:lang w:val="en-US"/>
+        </w:rPr>
+        <w:t>Generative AI with Large Language Models – DeepLearning.AI · AWS / Coursera</w:t>
+      </w:r>
+    </w:p>
+    <w:p>
+      <w:pPr>
+        <w:pStyle w:val="Prrafodelista"/>
+        <w:numPr>
+          <w:ilvl w:val="0"/>
+          <w:numId w:val="9"/>
+        </w:numPr>
+        <w:rPr>
+          <w:rFonts w:ascii="Tahoma" w:eastAsia="Tahoma" w:hAnsi="Tahoma" w:cs="Tahoma"/>
+          <w:sz w:val="20"/>
+          <w:szCs w:val="20"/>
+          <w:lang w:val="en-US"/>
+        </w:rPr>
+      </w:pPr>
+      <w:r>
+        <w:rPr>
+          <w:rFonts w:ascii="Tahoma" w:eastAsia="Tahoma" w:hAnsi="Tahoma" w:cs="Tahoma"/>
+          <w:sz w:val="20"/>
+          <w:szCs w:val="20"/>
+          <w:lang w:val="en-US"/>
+        </w:rPr>
+        <w:t>Generative AI: Prompt Engineering Basics – IBM / Coursera</w:t>
+      </w:r>
+    </w:p>
+    <w:p>
+      <w:pPr>
+        <w:pStyle w:val="Prrafodelista"/>
+        <w:numPr>
+          <w:ilvl w:val="0"/>
+          <w:numId w:val="9"/>
+        </w:numPr>
+        <w:rPr>
+          <w:rFonts w:ascii="Tahoma" w:eastAsia="Tahoma" w:hAnsi="Tahoma" w:cs="Tahoma"/>
+          <w:sz w:val="20"/>
+          <w:szCs w:val="20"/>
+          <w:lang w:val="en-US"/>
+        </w:rPr>
+      </w:pPr>
+      <w:proofErr w:type="spellStart"/>
+      <w:r>
+        <w:rPr>
+          <w:rFonts w:ascii="Tahoma" w:eastAsia="Tahoma" w:hAnsi="Tahoma" w:cs="Tahoma"/>
+          <w:sz w:val="20"/>
+          <w:szCs w:val="20"/>
+          <w:lang w:val="en-US"/>
+        </w:rPr>
+        <w:t>Seguridad</w:t>
+      </w:r>
+      <w:proofErr w:type="spellEnd"/>
+      <w:r>
+        <w:rPr>
+          <w:rFonts w:ascii="Tahoma" w:eastAsia="Tahoma" w:hAnsi="Tahoma" w:cs="Tahoma"/>
+          <w:sz w:val="20"/>
+          <w:szCs w:val="20"/>
+          <w:lang w:val="en-US"/>
+        </w:rPr>
+        <w:t xml:space="preserve"> de la </w:t>
+      </w:r>
+      <w:proofErr w:type="spellStart"/>
+      <w:r>
+        <w:rPr>
+          <w:rFonts w:ascii="Tahoma" w:eastAsia="Tahoma" w:hAnsi="Tahoma" w:cs="Tahoma"/>
+          <w:sz w:val="20"/>
+          <w:szCs w:val="20"/>
+          <w:lang w:val="en-US"/>
+        </w:rPr>
+        <w:t>información</w:t>
+      </w:r>
+      <w:proofErr w:type="spellEnd"/>
+      <w:r>
+        <w:rPr>
+          <w:rFonts w:ascii="Tahoma" w:eastAsia="Tahoma" w:hAnsi="Tahoma" w:cs="Tahoma"/>
           <w:sz w:val="20"/>
           <w:szCs w:val="20"/>
           <w:lang w:val="en-US"/>
@@ -3569,32 +5419,22 @@
         </w:numPr>
         <w:ind w:left="709"/>
         <w:rPr>
-          <w:rFonts w:ascii="Tahoma" w:eastAsia="Tahoma" w:hAnsi="Tahoma"/>
-          <w:bCs/>
-          <w:sz w:val="20"/>
-          <w:szCs w:val="20"/>
-          <w:lang w:val="en-US"/>
-        </w:rPr>
-      </w:pPr>
-      <w:r>
-        <w:rPr>
-          <w:rFonts w:ascii="Tahoma" w:eastAsia="Tahoma" w:hAnsi="Tahoma"/>
-          <w:bCs/>
-          <w:sz w:val="20"/>
-          <w:szCs w:val="20"/>
-          <w:lang w:val="en-US"/>
-        </w:rPr>
-        <w:t xml:space="preserve">Desarrollo de software Seguro – </w:t>
-      </w:r>
-      <w:r>
-        <w:rPr>
-          <w:rFonts w:ascii="Tahoma" w:eastAsia="Tahoma" w:hAnsi="Tahoma"/>
-          <w:bCs/>
-          <w:sz w:val="20"/>
-          <w:szCs w:val="20"/>
-          <w:lang w:val="en-US"/>
-        </w:rPr>
-        <w:t>MDP CONSULTING</w:t>
+          <w:rFonts w:ascii="Tahoma" w:eastAsia="Tahoma" w:hAnsi="Tahoma" w:cs="Tahoma"/>
+          <w:bCs/>
+          <w:sz w:val="20"/>
+          <w:szCs w:val="20"/>
+          <w:lang w:val="en-US"/>
+        </w:rPr>
+      </w:pPr>
+      <w:r>
+        <w:rPr>
+          <w:rFonts w:ascii="Tahoma" w:eastAsia="Tahoma" w:hAnsi="Tahoma" w:cs="Tahoma"/>
+          <w:bCs/>
+          <w:sz w:val="20"/>
+          <w:szCs w:val="20"/>
+          <w:lang w:val="en-US"/>
+        </w:rPr>
+        <w:t>Desarrollo de software Seguro – MDP CONSULTING</w:t>
       </w:r>
     </w:p>
     <w:p>
@@ -3613,16 +5453,18 @@
           <w:lang w:val="en-US"/>
         </w:rPr>
       </w:pPr>
-      <w:r>
-        <w:rPr>
-          <w:rFonts w:ascii="Tahoma" w:eastAsia="Tahoma" w:hAnsi="Tahoma"/>
-          <w:bCs/>
-          <w:sz w:val="20"/>
-          <w:szCs w:val="20"/>
-          <w:lang w:val="en-US"/>
-        </w:rPr>
-        <w:t>Finanzas personales</w:t>
-      </w:r>
+      <w:proofErr w:type="spellStart"/>
+      <w:r>
+        <w:rPr>
+          <w:rFonts w:ascii="Tahoma" w:eastAsia="Tahoma" w:hAnsi="Tahoma"/>
+          <w:bCs/>
+          <w:sz w:val="20"/>
+          <w:szCs w:val="20"/>
+          <w:lang w:val="en-US"/>
+        </w:rPr>
+        <w:t>Finanzas</w:t>
+      </w:r>
+      <w:proofErr w:type="spellEnd"/>
       <w:r>
         <w:rPr>
           <w:rFonts w:ascii="Tahoma" w:eastAsia="Tahoma" w:hAnsi="Tahoma"/>
@@ -3633,6 +5475,28 @@
         </w:rPr>
         <w:t xml:space="preserve"> </w:t>
       </w:r>
+      <w:proofErr w:type="spellStart"/>
+      <w:r>
+        <w:rPr>
+          <w:rFonts w:ascii="Tahoma" w:eastAsia="Tahoma" w:hAnsi="Tahoma"/>
+          <w:bCs/>
+          <w:sz w:val="20"/>
+          <w:szCs w:val="20"/>
+          <w:lang w:val="en-US"/>
+        </w:rPr>
+        <w:t>personales</w:t>
+      </w:r>
+      <w:proofErr w:type="spellEnd"/>
+      <w:r>
+        <w:rPr>
+          <w:rFonts w:ascii="Tahoma" w:eastAsia="Tahoma" w:hAnsi="Tahoma"/>
+          <w:bCs/>
+          <w:sz w:val="20"/>
+          <w:szCs w:val="20"/>
+          <w:lang w:val="en-US"/>
+        </w:rPr>
+        <w:t xml:space="preserve"> </w:t>
+      </w:r>
       <w:r>
         <w:rPr>
           <w:rFonts w:ascii="Tahoma" w:eastAsia="Tahoma" w:hAnsi="Tahoma"/>
@@ -3744,16 +5608,40 @@
           <w:lang w:val="en-US"/>
         </w:rPr>
       </w:pPr>
-      <w:r>
-        <w:rPr>
-          <w:rFonts w:ascii="Tahoma" w:eastAsia="Tahoma" w:hAnsi="Tahoma"/>
-          <w:bCs/>
-          <w:sz w:val="20"/>
-          <w:szCs w:val="20"/>
-          <w:lang w:val="en-US"/>
-        </w:rPr>
-        <w:t>Flujo de Desarrollo moderno Codestream</w:t>
-      </w:r>
+      <w:proofErr w:type="spellStart"/>
+      <w:r>
+        <w:rPr>
+          <w:rFonts w:ascii="Tahoma" w:eastAsia="Tahoma" w:hAnsi="Tahoma"/>
+          <w:bCs/>
+          <w:sz w:val="20"/>
+          <w:szCs w:val="20"/>
+          <w:lang w:val="en-US"/>
+        </w:rPr>
+        <w:t>Flujo</w:t>
+      </w:r>
+      <w:proofErr w:type="spellEnd"/>
+      <w:r>
+        <w:rPr>
+          <w:rFonts w:ascii="Tahoma" w:eastAsia="Tahoma" w:hAnsi="Tahoma"/>
+          <w:bCs/>
+          <w:sz w:val="20"/>
+          <w:szCs w:val="20"/>
+          <w:lang w:val="en-US"/>
+        </w:rPr>
+        <w:t xml:space="preserve"> de Desarrollo </w:t>
+      </w:r>
+      <w:proofErr w:type="spellStart"/>
+      <w:r>
+        <w:rPr>
+          <w:rFonts w:ascii="Tahoma" w:eastAsia="Tahoma" w:hAnsi="Tahoma"/>
+          <w:bCs/>
+          <w:sz w:val="20"/>
+          <w:szCs w:val="20"/>
+          <w:lang w:val="en-US"/>
+        </w:rPr>
+        <w:t>moderno</w:t>
+      </w:r>
+      <w:proofErr w:type="spellEnd"/>
       <w:r>
         <w:rPr>
           <w:rFonts w:ascii="Tahoma" w:eastAsia="Tahoma" w:hAnsi="Tahoma"/>
@@ -3764,6 +5652,28 @@
         </w:rPr>
         <w:t xml:space="preserve"> </w:t>
       </w:r>
+      <w:proofErr w:type="spellStart"/>
+      <w:r>
+        <w:rPr>
+          <w:rFonts w:ascii="Tahoma" w:eastAsia="Tahoma" w:hAnsi="Tahoma"/>
+          <w:bCs/>
+          <w:sz w:val="20"/>
+          <w:szCs w:val="20"/>
+          <w:lang w:val="en-US"/>
+        </w:rPr>
+        <w:t>Codestream</w:t>
+      </w:r>
+      <w:proofErr w:type="spellEnd"/>
+      <w:r>
+        <w:rPr>
+          <w:rFonts w:ascii="Tahoma" w:eastAsia="Tahoma" w:hAnsi="Tahoma"/>
+          <w:bCs/>
+          <w:sz w:val="20"/>
+          <w:szCs w:val="20"/>
+          <w:lang w:val="en-US"/>
+        </w:rPr>
+        <w:t xml:space="preserve"> </w:t>
+      </w:r>
       <w:r>
         <w:rPr>
           <w:rFonts w:ascii="Tahoma" w:eastAsia="Tahoma" w:hAnsi="Tahoma"/>
@@ -3837,16 +5747,29 @@
           <w:lang w:val="en-US"/>
         </w:rPr>
       </w:pPr>
-      <w:r>
-        <w:rPr>
-          <w:rFonts w:ascii="Tahoma" w:eastAsia="Tahoma" w:hAnsi="Tahoma"/>
-          <w:bCs/>
-          <w:sz w:val="20"/>
-          <w:szCs w:val="20"/>
-          <w:lang w:val="en-US"/>
-        </w:rPr>
-        <w:t xml:space="preserve">Curso </w:t>
-      </w:r>
+      <w:proofErr w:type="spellStart"/>
+      <w:r>
+        <w:rPr>
+          <w:rFonts w:ascii="Tahoma" w:eastAsia="Tahoma" w:hAnsi="Tahoma"/>
+          <w:bCs/>
+          <w:sz w:val="20"/>
+          <w:szCs w:val="20"/>
+          <w:lang w:val="en-US"/>
+        </w:rPr>
+        <w:t>Curso</w:t>
+      </w:r>
+      <w:proofErr w:type="spellEnd"/>
+      <w:r>
+        <w:rPr>
+          <w:rFonts w:ascii="Tahoma" w:eastAsia="Tahoma" w:hAnsi="Tahoma"/>
+          <w:bCs/>
+          <w:sz w:val="20"/>
+          <w:szCs w:val="20"/>
+          <w:lang w:val="en-US"/>
+        </w:rPr>
+        <w:t xml:space="preserve"> </w:t>
+      </w:r>
+      <w:proofErr w:type="spellStart"/>
       <w:r>
         <w:rPr>
           <w:rFonts w:ascii="Tahoma" w:eastAsia="Tahoma" w:hAnsi="Tahoma"/>
@@ -3857,6 +5780,7 @@
         </w:rPr>
         <w:t>Práctico</w:t>
       </w:r>
+      <w:proofErr w:type="spellEnd"/>
       <w:r>
         <w:rPr>
           <w:rFonts w:ascii="Tahoma" w:eastAsia="Tahoma" w:hAnsi="Tahoma"/>
@@ -3940,16 +5864,18 @@
           <w:lang w:val="en-US"/>
         </w:rPr>
       </w:pPr>
-      <w:r>
-        <w:rPr>
-          <w:rFonts w:ascii="Tahoma" w:eastAsia="Tahoma" w:hAnsi="Tahoma"/>
-          <w:bCs/>
-          <w:sz w:val="20"/>
-          <w:szCs w:val="20"/>
-          <w:lang w:val="en-US"/>
-        </w:rPr>
-        <w:t>Curso Básico de JavaScript</w:t>
-      </w:r>
+      <w:proofErr w:type="spellStart"/>
+      <w:r>
+        <w:rPr>
+          <w:rFonts w:ascii="Tahoma" w:eastAsia="Tahoma" w:hAnsi="Tahoma"/>
+          <w:bCs/>
+          <w:sz w:val="20"/>
+          <w:szCs w:val="20"/>
+          <w:lang w:val="en-US"/>
+        </w:rPr>
+        <w:t>Curso</w:t>
+      </w:r>
+      <w:proofErr w:type="spellEnd"/>
       <w:r>
         <w:rPr>
           <w:rFonts w:ascii="Tahoma" w:eastAsia="Tahoma" w:hAnsi="Tahoma"/>
@@ -3960,6 +5886,38 @@
         </w:rPr>
         <w:t xml:space="preserve"> </w:t>
       </w:r>
+      <w:proofErr w:type="spellStart"/>
+      <w:r>
+        <w:rPr>
+          <w:rFonts w:ascii="Tahoma" w:eastAsia="Tahoma" w:hAnsi="Tahoma"/>
+          <w:bCs/>
+          <w:sz w:val="20"/>
+          <w:szCs w:val="20"/>
+          <w:lang w:val="en-US"/>
+        </w:rPr>
+        <w:t>Básico</w:t>
+      </w:r>
+      <w:proofErr w:type="spellEnd"/>
+      <w:r>
+        <w:rPr>
+          <w:rFonts w:ascii="Tahoma" w:eastAsia="Tahoma" w:hAnsi="Tahoma"/>
+          <w:bCs/>
+          <w:sz w:val="20"/>
+          <w:szCs w:val="20"/>
+          <w:lang w:val="en-US"/>
+        </w:rPr>
+        <w:t xml:space="preserve"> de JavaScript</w:t>
+      </w:r>
+      <w:r>
+        <w:rPr>
+          <w:rFonts w:ascii="Tahoma" w:eastAsia="Tahoma" w:hAnsi="Tahoma"/>
+          <w:bCs/>
+          <w:sz w:val="20"/>
+          <w:szCs w:val="20"/>
+          <w:lang w:val="en-US"/>
+        </w:rPr>
+        <w:t xml:space="preserve"> </w:t>
+      </w:r>
       <w:r>
         <w:rPr>
           <w:rFonts w:ascii="Tahoma" w:eastAsia="Tahoma" w:hAnsi="Tahoma"/>
@@ -3986,15 +5944,49 @@
           <w:lang w:val="en-US"/>
         </w:rPr>
       </w:pPr>
-      <w:r>
-        <w:rPr>
-          <w:rFonts w:ascii="Tahoma" w:eastAsia="Tahoma" w:hAnsi="Tahoma"/>
-          <w:bCs/>
-          <w:sz w:val="20"/>
-          <w:szCs w:val="20"/>
-          <w:lang w:val="en-US"/>
-        </w:rPr>
-        <w:t>Diseño Publicitario – KB SOLUCIONES</w:t>
+      <w:proofErr w:type="spellStart"/>
+      <w:r>
+        <w:rPr>
+          <w:rFonts w:ascii="Tahoma" w:eastAsia="Tahoma" w:hAnsi="Tahoma"/>
+          <w:bCs/>
+          <w:sz w:val="20"/>
+          <w:szCs w:val="20"/>
+          <w:lang w:val="en-US"/>
+        </w:rPr>
+        <w:t>Diseño</w:t>
+      </w:r>
+      <w:proofErr w:type="spellEnd"/>
+      <w:r>
+        <w:rPr>
+          <w:rFonts w:ascii="Tahoma" w:eastAsia="Tahoma" w:hAnsi="Tahoma"/>
+          <w:bCs/>
+          <w:sz w:val="20"/>
+          <w:szCs w:val="20"/>
+          <w:lang w:val="en-US"/>
+        </w:rPr>
+        <w:t xml:space="preserve"> </w:t>
+      </w:r>
+      <w:proofErr w:type="spellStart"/>
+      <w:r>
+        <w:rPr>
+          <w:rFonts w:ascii="Tahoma" w:eastAsia="Tahoma" w:hAnsi="Tahoma"/>
+          <w:bCs/>
+          <w:sz w:val="20"/>
+          <w:szCs w:val="20"/>
+          <w:lang w:val="en-US"/>
+        </w:rPr>
+        <w:t>Publicitario</w:t>
+      </w:r>
+      <w:proofErr w:type="spellEnd"/>
+      <w:r>
+        <w:rPr>
+          <w:rFonts w:ascii="Tahoma" w:eastAsia="Tahoma" w:hAnsi="Tahoma"/>
+          <w:bCs/>
+          <w:sz w:val="20"/>
+          <w:szCs w:val="20"/>
+          <w:lang w:val="en-US"/>
+        </w:rPr>
+        <w:t xml:space="preserve"> – KB SOLUCIONES</w:t>
       </w:r>
     </w:p>
     <w:p>
@@ -4038,15 +6030,27 @@
           <w:lang w:val="en-US"/>
         </w:rPr>
       </w:pPr>
-      <w:r>
-        <w:rPr>
-          <w:rFonts w:ascii="Tahoma" w:eastAsia="Tahoma" w:hAnsi="Tahoma"/>
-          <w:bCs/>
-          <w:sz w:val="20"/>
-          <w:szCs w:val="20"/>
-          <w:lang w:val="en-US"/>
-        </w:rPr>
-        <w:t>Php y MySQL– KB SOLUCIONES</w:t>
+      <w:proofErr w:type="spellStart"/>
+      <w:r>
+        <w:rPr>
+          <w:rFonts w:ascii="Tahoma" w:eastAsia="Tahoma" w:hAnsi="Tahoma"/>
+          <w:bCs/>
+          <w:sz w:val="20"/>
+          <w:szCs w:val="20"/>
+          <w:lang w:val="en-US"/>
+        </w:rPr>
+        <w:t>Php</w:t>
+      </w:r>
+      <w:proofErr w:type="spellEnd"/>
+      <w:r>
+        <w:rPr>
+          <w:rFonts w:ascii="Tahoma" w:eastAsia="Tahoma" w:hAnsi="Tahoma"/>
+          <w:bCs/>
+          <w:sz w:val="20"/>
+          <w:szCs w:val="20"/>
+          <w:lang w:val="en-US"/>
+        </w:rPr>
+        <w:t xml:space="preserve"> y MySQL– KB SOLUCIONES</w:t>
       </w:r>
     </w:p>
     <w:p>
@@ -4064,15 +6068,49 @@
           <w:lang w:val="en-US"/>
         </w:rPr>
       </w:pPr>
-      <w:r>
-        <w:rPr>
-          <w:rFonts w:ascii="Tahoma" w:eastAsia="Tahoma" w:hAnsi="Tahoma"/>
-          <w:bCs/>
-          <w:sz w:val="20"/>
-          <w:szCs w:val="20"/>
-          <w:lang w:val="en-US"/>
-        </w:rPr>
-        <w:t>Estructura y Modelado de Base de Datos – KB SOLUCIONES</w:t>
+      <w:proofErr w:type="spellStart"/>
+      <w:r>
+        <w:rPr>
+          <w:rFonts w:ascii="Tahoma" w:eastAsia="Tahoma" w:hAnsi="Tahoma"/>
+          <w:bCs/>
+          <w:sz w:val="20"/>
+          <w:szCs w:val="20"/>
+          <w:lang w:val="en-US"/>
+        </w:rPr>
+        <w:t>Estructura</w:t>
+      </w:r>
+      <w:proofErr w:type="spellEnd"/>
+      <w:r>
+        <w:rPr>
+          <w:rFonts w:ascii="Tahoma" w:eastAsia="Tahoma" w:hAnsi="Tahoma"/>
+          <w:bCs/>
+          <w:sz w:val="20"/>
+          <w:szCs w:val="20"/>
+          <w:lang w:val="en-US"/>
+        </w:rPr>
+        <w:t xml:space="preserve"> y </w:t>
+      </w:r>
+      <w:proofErr w:type="spellStart"/>
+      <w:r>
+        <w:rPr>
+          <w:rFonts w:ascii="Tahoma" w:eastAsia="Tahoma" w:hAnsi="Tahoma"/>
+          <w:bCs/>
+          <w:sz w:val="20"/>
+          <w:szCs w:val="20"/>
+          <w:lang w:val="en-US"/>
+        </w:rPr>
+        <w:t>Modelado</w:t>
+      </w:r>
+      <w:proofErr w:type="spellEnd"/>
+      <w:r>
+        <w:rPr>
+          <w:rFonts w:ascii="Tahoma" w:eastAsia="Tahoma" w:hAnsi="Tahoma"/>
+          <w:bCs/>
+          <w:sz w:val="20"/>
+          <w:szCs w:val="20"/>
+          <w:lang w:val="en-US"/>
+        </w:rPr>
+        <w:t xml:space="preserve"> de Base de Datos – KB SOLUCIONES</w:t>
       </w:r>
     </w:p>
     <w:p>
@@ -4959,7 +6997,7 @@
   <w:abstractNum w:abstractNumId="10" w15:restartNumberingAfterBreak="0">
     <w:nsid w:val="49FD36A8"/>
     <w:multiLevelType w:val="hybridMultilevel"/>
-    <w:tmpl w:val="08D40972"/>
+    <w:tmpl w:val="62EC5A2C"/>
     <w:lvl w:ilvl="0" w:tplc="280A0001">
       <w:start w:val="1"/>
       <w:numFmt w:val="bullet"/>
@@ -6230,6 +8268,7 @@
   <w:style w:type="character" w:default="1" w:styleId="Fuentedeprrafopredeter">
     <w:name w:val="Default Paragraph Font"/>
     <w:uiPriority w:val="1"/>
+    <w:semiHidden/>
     <w:unhideWhenUsed/>
   </w:style>
   <w:style w:type="table" w:default="1" w:styleId="Tablanormal">

</xml_diff>